<commit_message>
Tài liệu đặc tả yêu cầu (Tuần 1-2)
</commit_message>
<xml_diff>
--- a/363_TaiLieuDacTaYeuCau_TranThiHoai.docx
+++ b/363_TaiLieuDacTaYeuCau_TranThiHoai.docx
@@ -4,6 +4,628 @@
   <w:body>
     <w:p>
       <w:pPr>
+        <w:spacing w:before="240" w:after="240"/>
+        <w:jc w:val="center"/>
+        <w:rPr>
+          <w:rFonts w:ascii="Times New Roman" w:hAnsi="Times New Roman" w:cs="Times New Roman"/>
+          <w:b/>
+          <w:sz w:val="28"/>
+          <w:szCs w:val="28"/>
+        </w:rPr>
+      </w:pPr>
+      <w:r>
+        <w:rPr>
+          <w:rFonts w:ascii="Times New Roman" w:hAnsi="Times New Roman" w:cs="Times New Roman"/>
+          <w:b/>
+          <w:sz w:val="28"/>
+          <w:szCs w:val="28"/>
+        </w:rPr>
+        <w:t>TRƯỜNG ĐẠI HỌC THUỶ LỢI</w:t>
+      </w:r>
+    </w:p>
+    <w:p>
+      <w:pPr>
+        <w:spacing w:before="240" w:after="240"/>
+        <w:jc w:val="center"/>
+        <w:rPr>
+          <w:rFonts w:ascii="Times New Roman" w:hAnsi="Times New Roman" w:cs="Times New Roman"/>
+          <w:b/>
+          <w:sz w:val="28"/>
+          <w:szCs w:val="28"/>
+        </w:rPr>
+      </w:pPr>
+      <w:r>
+        <w:rPr>
+          <w:rFonts w:ascii="Times New Roman" w:hAnsi="Times New Roman" w:cs="Times New Roman"/>
+          <w:b/>
+          <w:sz w:val="28"/>
+          <w:szCs w:val="28"/>
+        </w:rPr>
+        <w:t>KHOA CÔNG NGHỆ THÔNG TIN</w:t>
+      </w:r>
+    </w:p>
+    <w:p>
+      <w:pPr>
+        <w:spacing w:before="240" w:after="240"/>
+        <w:jc w:val="center"/>
+        <w:rPr>
+          <w:rFonts w:ascii="Times New Roman" w:hAnsi="Times New Roman" w:cs="Times New Roman"/>
+          <w:b/>
+          <w:sz w:val="28"/>
+          <w:szCs w:val="28"/>
+          <w:lang w:val="en-US"/>
+        </w:rPr>
+      </w:pPr>
+      <w:r>
+        <w:rPr>
+          <w:rFonts w:ascii="Times New Roman" w:hAnsi="Times New Roman" w:cs="Times New Roman"/>
+          <w:b/>
+          <w:sz w:val="28"/>
+          <w:szCs w:val="28"/>
+        </w:rPr>
+        <w:t>--------------------------------</w:t>
+      </w:r>
+    </w:p>
+    <w:p>
+      <w:pPr>
+        <w:spacing w:before="240" w:after="240"/>
+        <w:jc w:val="center"/>
+        <w:rPr>
+          <w:rFonts w:ascii="Times New Roman" w:hAnsi="Times New Roman" w:cs="Times New Roman"/>
+          <w:sz w:val="28"/>
+          <w:szCs w:val="28"/>
+          <w:lang w:val="en-US"/>
+        </w:rPr>
+      </w:pPr>
+      <w:r>
+        <w:rPr>
+          <w:rFonts w:ascii="Times New Roman" w:hAnsi="Times New Roman" w:cs="Times New Roman"/>
+          <w:noProof/>
+          <w:sz w:val="28"/>
+          <w:szCs w:val="28"/>
+        </w:rPr>
+        <w:drawing>
+          <wp:inline distT="114300" distB="114300" distL="114300" distR="114300" wp14:anchorId="145E1AEE" wp14:editId="793BD88D">
+            <wp:extent cx="2582545" cy="1546860"/>
+            <wp:effectExtent l="0" t="0" r="8255" b="0"/>
+            <wp:docPr id="97" name="image97.png"/>
+            <wp:cNvGraphicFramePr/>
+            <a:graphic xmlns:a="http://schemas.openxmlformats.org/drawingml/2006/main">
+              <a:graphicData uri="http://schemas.openxmlformats.org/drawingml/2006/picture">
+                <pic:pic xmlns:pic="http://schemas.openxmlformats.org/drawingml/2006/picture">
+                  <pic:nvPicPr>
+                    <pic:cNvPr id="0" name="image97.png"/>
+                    <pic:cNvPicPr preferRelativeResize="0"/>
+                  </pic:nvPicPr>
+                  <pic:blipFill>
+                    <a:blip r:embed="rId5"/>
+                    <a:srcRect/>
+                    <a:stretch>
+                      <a:fillRect/>
+                    </a:stretch>
+                  </pic:blipFill>
+                  <pic:spPr>
+                    <a:xfrm>
+                      <a:off x="0" y="0"/>
+                      <a:ext cx="2582702" cy="1546954"/>
+                    </a:xfrm>
+                    <a:prstGeom prst="rect">
+                      <a:avLst/>
+                    </a:prstGeom>
+                    <a:ln/>
+                  </pic:spPr>
+                </pic:pic>
+              </a:graphicData>
+            </a:graphic>
+          </wp:inline>
+        </w:drawing>
+      </w:r>
+    </w:p>
+    <w:p>
+      <w:pPr>
+        <w:spacing w:before="240" w:after="240"/>
+        <w:jc w:val="center"/>
+        <w:rPr>
+          <w:rFonts w:ascii="Times New Roman" w:hAnsi="Times New Roman" w:cs="Times New Roman"/>
+          <w:b/>
+          <w:sz w:val="28"/>
+          <w:szCs w:val="28"/>
+          <w:lang w:val="en-US"/>
+        </w:rPr>
+      </w:pPr>
+    </w:p>
+    <w:p>
+      <w:pPr>
+        <w:spacing w:before="240" w:after="240"/>
+        <w:jc w:val="center"/>
+        <w:rPr>
+          <w:rFonts w:ascii="Times New Roman" w:hAnsi="Times New Roman" w:cs="Times New Roman"/>
+          <w:b/>
+          <w:sz w:val="28"/>
+          <w:szCs w:val="28"/>
+          <w:lang w:val="en-US"/>
+        </w:rPr>
+      </w:pPr>
+      <w:r>
+        <w:rPr>
+          <w:rFonts w:ascii="Times New Roman" w:hAnsi="Times New Roman" w:cs="Times New Roman"/>
+          <w:b/>
+          <w:sz w:val="28"/>
+          <w:szCs w:val="28"/>
+          <w:lang w:val="en-US"/>
+        </w:rPr>
+        <w:t>BÁO CÁO TIẾN ĐỘ ĐỒ ÁN TỐT NGHIỆP</w:t>
+      </w:r>
+    </w:p>
+    <w:p>
+      <w:pPr>
+        <w:spacing w:before="240" w:after="240"/>
+        <w:jc w:val="center"/>
+        <w:rPr>
+          <w:rFonts w:ascii="Times New Roman" w:hAnsi="Times New Roman" w:cs="Times New Roman"/>
+          <w:b/>
+          <w:sz w:val="28"/>
+          <w:szCs w:val="28"/>
+        </w:rPr>
+      </w:pPr>
+      <w:r>
+        <w:rPr>
+          <w:rFonts w:ascii="Times New Roman" w:hAnsi="Times New Roman" w:cs="Times New Roman"/>
+          <w:b/>
+          <w:sz w:val="28"/>
+          <w:szCs w:val="28"/>
+          <w:lang w:val="en-US"/>
+        </w:rPr>
+        <w:t>ĐỀ TÀI</w:t>
+      </w:r>
+      <w:r>
+        <w:rPr>
+          <w:rFonts w:ascii="Times New Roman" w:hAnsi="Times New Roman" w:cs="Times New Roman"/>
+          <w:b/>
+          <w:sz w:val="28"/>
+          <w:szCs w:val="28"/>
+        </w:rPr>
+        <w:t xml:space="preserve">: </w:t>
+      </w:r>
+      <w:r>
+        <w:rPr>
+          <w:rFonts w:ascii="Times New Roman" w:hAnsi="Times New Roman" w:cs="Times New Roman"/>
+          <w:b/>
+          <w:sz w:val="28"/>
+          <w:szCs w:val="28"/>
+          <w:lang w:val="en-US"/>
+        </w:rPr>
+        <w:t xml:space="preserve">XÂY DỰNG HỆ THỐNG </w:t>
+      </w:r>
+      <w:r>
+        <w:rPr>
+          <w:rFonts w:ascii="Times New Roman" w:hAnsi="Times New Roman" w:cs="Times New Roman"/>
+          <w:b/>
+          <w:sz w:val="28"/>
+          <w:szCs w:val="28"/>
+        </w:rPr>
+        <w:t>QUẢN LÝ</w:t>
+      </w:r>
+      <w:r>
+        <w:rPr>
+          <w:rFonts w:ascii="Times New Roman" w:hAnsi="Times New Roman" w:cs="Times New Roman"/>
+          <w:b/>
+          <w:sz w:val="28"/>
+          <w:szCs w:val="28"/>
+          <w:lang w:val="en-US"/>
+        </w:rPr>
+        <w:t xml:space="preserve"> VÀ BÁN THỰC PHẨM TRỰC TUYẾN TÍCH HỢP GỢI Ý SẢN PHẨM (RECOMMENDATION SYSTEM)</w:t>
+      </w:r>
+      <w:r>
+        <w:rPr>
+          <w:rFonts w:ascii="Times New Roman" w:hAnsi="Times New Roman" w:cs="Times New Roman"/>
+          <w:b/>
+          <w:sz w:val="28"/>
+          <w:szCs w:val="28"/>
+        </w:rPr>
+        <w:t xml:space="preserve"> </w:t>
+      </w:r>
+    </w:p>
+    <w:p>
+      <w:pPr>
+        <w:pBdr>
+          <w:top w:val="nil"/>
+          <w:left w:val="nil"/>
+          <w:bottom w:val="nil"/>
+          <w:right w:val="nil"/>
+          <w:between w:val="nil"/>
+        </w:pBdr>
+        <w:spacing w:before="240"/>
+        <w:ind w:left="720"/>
+        <w:rPr>
+          <w:rFonts w:ascii="Times New Roman" w:hAnsi="Times New Roman" w:cs="Times New Roman"/>
+          <w:color w:val="000000"/>
+        </w:rPr>
+      </w:pPr>
+      <w:r>
+        <w:rPr>
+          <w:rFonts w:ascii="Times New Roman" w:hAnsi="Times New Roman" w:cs="Times New Roman"/>
+          <w:i/>
+          <w:color w:val="000000"/>
+          <w:sz w:val="26"/>
+          <w:szCs w:val="26"/>
+        </w:rPr>
+        <w:t>Sinh viên thực hiện</w:t>
+      </w:r>
+      <w:r>
+        <w:rPr>
+          <w:rFonts w:ascii="Times New Roman" w:hAnsi="Times New Roman" w:cs="Times New Roman"/>
+          <w:color w:val="000000"/>
+          <w:sz w:val="26"/>
+          <w:szCs w:val="26"/>
+        </w:rPr>
+        <w:t>:</w:t>
+      </w:r>
+      <w:r>
+        <w:rPr>
+          <w:rFonts w:ascii="Times New Roman" w:hAnsi="Times New Roman" w:cs="Times New Roman"/>
+          <w:color w:val="000000"/>
+          <w:sz w:val="26"/>
+          <w:szCs w:val="26"/>
+        </w:rPr>
+        <w:tab/>
+        <w:t>Trần Thị Hoài</w:t>
+      </w:r>
+    </w:p>
+    <w:p>
+      <w:pPr>
+        <w:pBdr>
+          <w:top w:val="nil"/>
+          <w:left w:val="nil"/>
+          <w:bottom w:val="nil"/>
+          <w:right w:val="nil"/>
+          <w:between w:val="nil"/>
+        </w:pBdr>
+        <w:spacing w:before="60"/>
+        <w:ind w:left="720"/>
+        <w:rPr>
+          <w:rFonts w:ascii="Times New Roman" w:hAnsi="Times New Roman" w:cs="Times New Roman"/>
+          <w:color w:val="000000"/>
+          <w:sz w:val="26"/>
+          <w:szCs w:val="26"/>
+        </w:rPr>
+      </w:pPr>
+      <w:r>
+        <w:rPr>
+          <w:rFonts w:ascii="Times New Roman" w:hAnsi="Times New Roman" w:cs="Times New Roman"/>
+          <w:i/>
+          <w:color w:val="000000"/>
+          <w:sz w:val="26"/>
+          <w:szCs w:val="26"/>
+        </w:rPr>
+        <w:t>Lớp</w:t>
+      </w:r>
+      <w:r>
+        <w:rPr>
+          <w:rFonts w:ascii="Times New Roman" w:hAnsi="Times New Roman" w:cs="Times New Roman"/>
+          <w:color w:val="000000"/>
+          <w:sz w:val="26"/>
+          <w:szCs w:val="26"/>
+        </w:rPr>
+        <w:t>: 64HTTT4</w:t>
+      </w:r>
+    </w:p>
+    <w:p>
+      <w:pPr>
+        <w:pBdr>
+          <w:top w:val="nil"/>
+          <w:left w:val="nil"/>
+          <w:bottom w:val="nil"/>
+          <w:right w:val="nil"/>
+          <w:between w:val="nil"/>
+        </w:pBdr>
+        <w:spacing w:before="60"/>
+        <w:ind w:left="720"/>
+        <w:rPr>
+          <w:rFonts w:ascii="Times New Roman" w:hAnsi="Times New Roman" w:cs="Times New Roman"/>
+          <w:color w:val="000000"/>
+          <w:sz w:val="26"/>
+          <w:szCs w:val="26"/>
+        </w:rPr>
+      </w:pPr>
+      <w:r>
+        <w:rPr>
+          <w:rFonts w:ascii="Times New Roman" w:hAnsi="Times New Roman" w:cs="Times New Roman"/>
+          <w:i/>
+          <w:color w:val="000000"/>
+          <w:sz w:val="26"/>
+          <w:szCs w:val="26"/>
+        </w:rPr>
+        <w:t>Mã sinh viên:</w:t>
+      </w:r>
+      <w:r>
+        <w:rPr>
+          <w:rFonts w:ascii="Times New Roman" w:hAnsi="Times New Roman" w:cs="Times New Roman"/>
+          <w:color w:val="000000"/>
+          <w:sz w:val="26"/>
+          <w:szCs w:val="26"/>
+        </w:rPr>
+        <w:t xml:space="preserve"> 2251162011</w:t>
+      </w:r>
+    </w:p>
+    <w:p>
+      <w:pPr>
+        <w:pBdr>
+          <w:top w:val="nil"/>
+          <w:left w:val="nil"/>
+          <w:bottom w:val="nil"/>
+          <w:right w:val="nil"/>
+          <w:between w:val="nil"/>
+        </w:pBdr>
+        <w:spacing w:before="60"/>
+        <w:ind w:left="720"/>
+        <w:rPr>
+          <w:rFonts w:ascii="Times New Roman" w:hAnsi="Times New Roman" w:cs="Times New Roman"/>
+          <w:color w:val="000000"/>
+          <w:sz w:val="26"/>
+          <w:szCs w:val="26"/>
+        </w:rPr>
+      </w:pPr>
+      <w:r>
+        <w:rPr>
+          <w:rFonts w:ascii="Times New Roman" w:hAnsi="Times New Roman" w:cs="Times New Roman"/>
+          <w:i/>
+          <w:color w:val="000000"/>
+          <w:sz w:val="26"/>
+          <w:szCs w:val="26"/>
+        </w:rPr>
+        <w:t xml:space="preserve">Số điện thoại: </w:t>
+      </w:r>
+      <w:r>
+        <w:rPr>
+          <w:rFonts w:ascii="Times New Roman" w:hAnsi="Times New Roman" w:cs="Times New Roman"/>
+          <w:iCs/>
+          <w:color w:val="000000"/>
+          <w:sz w:val="26"/>
+          <w:szCs w:val="26"/>
+        </w:rPr>
+        <w:t>0399106819</w:t>
+      </w:r>
+    </w:p>
+    <w:p>
+      <w:pPr>
+        <w:pBdr>
+          <w:top w:val="nil"/>
+          <w:left w:val="nil"/>
+          <w:bottom w:val="nil"/>
+          <w:right w:val="nil"/>
+          <w:between w:val="nil"/>
+        </w:pBdr>
+        <w:spacing w:before="60"/>
+        <w:ind w:left="720"/>
+        <w:rPr>
+          <w:rFonts w:ascii="Times New Roman" w:hAnsi="Times New Roman" w:cs="Times New Roman"/>
+          <w:color w:val="000000"/>
+        </w:rPr>
+      </w:pPr>
+      <w:r>
+        <w:rPr>
+          <w:rFonts w:ascii="Times New Roman" w:hAnsi="Times New Roman" w:cs="Times New Roman"/>
+          <w:i/>
+          <w:color w:val="000000"/>
+          <w:sz w:val="26"/>
+          <w:szCs w:val="26"/>
+        </w:rPr>
+        <w:t>Email:</w:t>
+      </w:r>
+      <w:r>
+        <w:rPr>
+          <w:rFonts w:ascii="Times New Roman" w:hAnsi="Times New Roman" w:cs="Times New Roman"/>
+          <w:color w:val="000000"/>
+          <w:sz w:val="26"/>
+          <w:szCs w:val="26"/>
+        </w:rPr>
+        <w:tab/>
+      </w:r>
+      <w:r>
+        <w:rPr>
+          <w:rFonts w:ascii="Times New Roman" w:hAnsi="Times New Roman" w:cs="Times New Roman"/>
+          <w:sz w:val="26"/>
+          <w:szCs w:val="26"/>
+        </w:rPr>
+        <w:t xml:space="preserve"> 2251162011@e.tlu.edu.vn</w:t>
+      </w:r>
+    </w:p>
+    <w:p>
+      <w:pPr>
+        <w:pBdr>
+          <w:top w:val="nil"/>
+          <w:left w:val="nil"/>
+          <w:bottom w:val="nil"/>
+          <w:right w:val="nil"/>
+          <w:between w:val="nil"/>
+        </w:pBdr>
+        <w:spacing w:before="60"/>
+        <w:ind w:left="720"/>
+        <w:rPr>
+          <w:rFonts w:ascii="Times New Roman" w:hAnsi="Times New Roman" w:cs="Times New Roman"/>
+          <w:color w:val="000000"/>
+          <w:sz w:val="26"/>
+          <w:szCs w:val="26"/>
+        </w:rPr>
+      </w:pPr>
+      <w:r>
+        <w:rPr>
+          <w:rFonts w:ascii="Times New Roman" w:hAnsi="Times New Roman" w:cs="Times New Roman"/>
+          <w:i/>
+          <w:color w:val="000000"/>
+          <w:sz w:val="26"/>
+          <w:szCs w:val="26"/>
+        </w:rPr>
+        <w:t>Giáo viên hướng dẫn</w:t>
+      </w:r>
+      <w:r>
+        <w:rPr>
+          <w:rFonts w:ascii="Times New Roman" w:hAnsi="Times New Roman" w:cs="Times New Roman"/>
+          <w:color w:val="000000"/>
+          <w:sz w:val="26"/>
+          <w:szCs w:val="26"/>
+        </w:rPr>
+        <w:t>: TS. Đỗ Oanh Cường</w:t>
+      </w:r>
+      <w:r>
+        <w:rPr>
+          <w:rFonts w:ascii="Times New Roman" w:hAnsi="Times New Roman" w:cs="Times New Roman"/>
+          <w:color w:val="000000"/>
+          <w:sz w:val="26"/>
+          <w:szCs w:val="26"/>
+        </w:rPr>
+        <w:tab/>
+        <w:t>Email: cuongdo@tlu.edu.vn</w:t>
+      </w:r>
+    </w:p>
+    <w:p>
+      <w:pPr>
+        <w:pBdr>
+          <w:top w:val="nil"/>
+          <w:left w:val="nil"/>
+          <w:bottom w:val="nil"/>
+          <w:right w:val="nil"/>
+          <w:between w:val="nil"/>
+        </w:pBdr>
+        <w:spacing w:before="60"/>
+        <w:ind w:left="720"/>
+        <w:rPr>
+          <w:rFonts w:ascii="Times New Roman" w:hAnsi="Times New Roman" w:cs="Times New Roman"/>
+          <w:color w:val="000000"/>
+        </w:rPr>
+      </w:pPr>
+      <w:r>
+        <w:rPr>
+          <w:rFonts w:ascii="Times New Roman" w:hAnsi="Times New Roman" w:cs="Times New Roman"/>
+          <w:color w:val="000000"/>
+          <w:sz w:val="26"/>
+          <w:szCs w:val="26"/>
+        </w:rPr>
+        <w:tab/>
+      </w:r>
+      <w:r>
+        <w:rPr>
+          <w:rFonts w:ascii="Times New Roman" w:hAnsi="Times New Roman" w:cs="Times New Roman"/>
+          <w:color w:val="000000"/>
+          <w:sz w:val="26"/>
+          <w:szCs w:val="26"/>
+        </w:rPr>
+        <w:tab/>
+      </w:r>
+      <w:r>
+        <w:rPr>
+          <w:rFonts w:ascii="Times New Roman" w:hAnsi="Times New Roman" w:cs="Times New Roman"/>
+          <w:color w:val="000000"/>
+          <w:sz w:val="26"/>
+          <w:szCs w:val="26"/>
+        </w:rPr>
+        <w:tab/>
+        <w:t xml:space="preserve">   ThS. Phạm Xuân Trung</w:t>
+      </w:r>
+      <w:r>
+        <w:rPr>
+          <w:rFonts w:ascii="Times New Roman" w:hAnsi="Times New Roman" w:cs="Times New Roman"/>
+          <w:color w:val="000000"/>
+          <w:sz w:val="26"/>
+          <w:szCs w:val="26"/>
+        </w:rPr>
+        <w:tab/>
+        <w:t>Email: trungpx@tlu.edu.vn</w:t>
+      </w:r>
+    </w:p>
+    <w:p>
+      <w:pPr>
+        <w:spacing w:before="240" w:after="240"/>
+        <w:ind w:left="3690" w:hanging="540"/>
+        <w:rPr>
+          <w:rFonts w:ascii="Times New Roman" w:hAnsi="Times New Roman" w:cs="Times New Roman"/>
+          <w:i/>
+          <w:sz w:val="28"/>
+          <w:szCs w:val="28"/>
+        </w:rPr>
+      </w:pPr>
+    </w:p>
+    <w:p>
+      <w:pPr>
+        <w:spacing w:before="240" w:after="240"/>
+        <w:ind w:left="3690" w:hanging="540"/>
+        <w:rPr>
+          <w:rFonts w:ascii="Times New Roman" w:hAnsi="Times New Roman" w:cs="Times New Roman"/>
+          <w:i/>
+          <w:sz w:val="28"/>
+          <w:szCs w:val="28"/>
+        </w:rPr>
+      </w:pPr>
+    </w:p>
+    <w:p>
+      <w:pPr>
+        <w:spacing w:line="259" w:lineRule="auto"/>
+        <w:jc w:val="center"/>
+        <w:rPr>
+          <w:rFonts w:ascii="Times New Roman" w:hAnsi="Times New Roman" w:cs="Times New Roman"/>
+          <w:b/>
+          <w:sz w:val="28"/>
+          <w:szCs w:val="28"/>
+        </w:rPr>
+      </w:pPr>
+      <w:r>
+        <w:rPr>
+          <w:rFonts w:ascii="Times New Roman" w:hAnsi="Times New Roman" w:cs="Times New Roman"/>
+          <w:b/>
+          <w:sz w:val="28"/>
+          <w:szCs w:val="28"/>
+        </w:rPr>
+        <w:t xml:space="preserve">Hà Nội,  ngày </w:t>
+      </w:r>
+      <w:r>
+        <w:rPr>
+          <w:rFonts w:ascii="Times New Roman" w:hAnsi="Times New Roman" w:cs="Times New Roman"/>
+          <w:b/>
+          <w:sz w:val="28"/>
+          <w:szCs w:val="28"/>
+        </w:rPr>
+        <w:t>3</w:t>
+      </w:r>
+      <w:r>
+        <w:rPr>
+          <w:rFonts w:ascii="Times New Roman" w:hAnsi="Times New Roman" w:cs="Times New Roman"/>
+          <w:b/>
+          <w:sz w:val="28"/>
+          <w:szCs w:val="28"/>
+        </w:rPr>
+        <w:t xml:space="preserve"> tháng </w:t>
+      </w:r>
+      <w:r>
+        <w:rPr>
+          <w:rFonts w:ascii="Times New Roman" w:hAnsi="Times New Roman" w:cs="Times New Roman"/>
+          <w:b/>
+          <w:sz w:val="28"/>
+          <w:szCs w:val="28"/>
+        </w:rPr>
+        <w:t>4</w:t>
+      </w:r>
+      <w:r>
+        <w:rPr>
+          <w:rFonts w:ascii="Times New Roman" w:hAnsi="Times New Roman" w:cs="Times New Roman"/>
+          <w:b/>
+          <w:sz w:val="28"/>
+          <w:szCs w:val="28"/>
+        </w:rPr>
+        <w:t xml:space="preserve"> năm 202</w:t>
+      </w:r>
+      <w:r>
+        <w:rPr>
+          <w:rFonts w:ascii="Times New Roman" w:hAnsi="Times New Roman" w:cs="Times New Roman"/>
+          <w:b/>
+          <w:sz w:val="28"/>
+          <w:szCs w:val="28"/>
+        </w:rPr>
+        <w:t>6</w:t>
+      </w:r>
+    </w:p>
+    <w:p>
+      <w:pPr>
         <w:spacing w:line="360" w:lineRule="auto"/>
         <w:jc w:val="center"/>
         <w:rPr>
@@ -12,10 +634,13 @@
           <w:bCs/>
           <w:sz w:val="26"/>
           <w:szCs w:val="26"/>
-          <w:lang w:val="en-US"/>
-        </w:rPr>
-      </w:pPr>
-      <w:r>
+        </w:rPr>
+      </w:pPr>
+    </w:p>
+    <w:p>
+      <w:pPr>
+        <w:spacing w:line="360" w:lineRule="auto"/>
+        <w:jc w:val="center"/>
         <w:rPr>
           <w:rFonts w:ascii="Times New Roman" w:hAnsi="Times New Roman" w:cs="Times New Roman"/>
           <w:b/>
@@ -24,18 +649,8 @@
           <w:szCs w:val="26"/>
           <w:lang w:val="en-US"/>
         </w:rPr>
-        <w:t>TÀI LIỆU ĐẶC TẢ YÊU CẦU</w:t>
-      </w:r>
-    </w:p>
-    <w:p>
-      <w:pPr>
-        <w:pStyle w:val="oancuaDanhsach"/>
-        <w:numPr>
-          <w:ilvl w:val="0"/>
-          <w:numId w:val="1"/>
-        </w:numPr>
-        <w:spacing w:line="360" w:lineRule="auto"/>
-        <w:jc w:val="both"/>
+      </w:pPr>
+      <w:r>
         <w:rPr>
           <w:rFonts w:ascii="Times New Roman" w:hAnsi="Times New Roman" w:cs="Times New Roman"/>
           <w:b/>
@@ -44,8 +659,18 @@
           <w:szCs w:val="26"/>
           <w:lang w:val="en-US"/>
         </w:rPr>
-      </w:pPr>
-      <w:r>
+        <w:t>CHƯƠNG 1: KHẢO SÁT VÀ PHÂN TÍCH YÊU CẦU HỆ THỐNG</w:t>
+      </w:r>
+    </w:p>
+    <w:p>
+      <w:pPr>
+        <w:pStyle w:val="oancuaDanhsach"/>
+        <w:numPr>
+          <w:ilvl w:val="0"/>
+          <w:numId w:val="1"/>
+        </w:numPr>
+        <w:spacing w:line="360" w:lineRule="auto"/>
+        <w:jc w:val="both"/>
         <w:rPr>
           <w:rFonts w:ascii="Times New Roman" w:hAnsi="Times New Roman" w:cs="Times New Roman"/>
           <w:b/>
@@ -54,81 +679,8 @@
           <w:szCs w:val="26"/>
           <w:lang w:val="en-US"/>
         </w:rPr>
-        <w:t>Giới thiệu</w:t>
-      </w:r>
-    </w:p>
-    <w:p>
-      <w:pPr>
-        <w:spacing w:line="360" w:lineRule="auto"/>
-        <w:ind w:left="360"/>
-        <w:jc w:val="both"/>
-        <w:rPr>
-          <w:rFonts w:ascii="Times New Roman" w:hAnsi="Times New Roman" w:cs="Times New Roman"/>
-          <w:sz w:val="26"/>
-          <w:szCs w:val="26"/>
-          <w:lang w:val="en-US"/>
-        </w:rPr>
-      </w:pPr>
-      <w:r>
-        <w:rPr>
-          <w:rFonts w:ascii="Times New Roman" w:hAnsi="Times New Roman" w:cs="Times New Roman"/>
-          <w:sz w:val="26"/>
-          <w:szCs w:val="26"/>
-        </w:rPr>
-        <w:t>Trong bối cảnh thương mại điện tử phát triển mạnh mẽ, nhu cầu mua sắm thực phẩm trực tuyến ngày càng gia tăng. Tuy nhiên, nhiều cửa hàng nhỏ lẻ vẫn chưa có hệ thống quản lý và bán hàng hiệu quả, gây khó khăn trong việc vận hành và tiếp cận khách hàng.</w:t>
-      </w:r>
-    </w:p>
-    <w:p>
-      <w:pPr>
-        <w:spacing w:line="360" w:lineRule="auto"/>
-        <w:ind w:left="360"/>
-        <w:jc w:val="both"/>
-        <w:rPr>
-          <w:rFonts w:ascii="Times New Roman" w:hAnsi="Times New Roman" w:cs="Times New Roman"/>
-          <w:sz w:val="26"/>
-          <w:szCs w:val="26"/>
-          <w:lang w:val="en-US"/>
-        </w:rPr>
-      </w:pPr>
-      <w:r>
-        <w:rPr>
-          <w:rFonts w:ascii="Times New Roman" w:hAnsi="Times New Roman" w:cs="Times New Roman"/>
-          <w:sz w:val="26"/>
-          <w:szCs w:val="26"/>
-        </w:rPr>
-        <w:t>Hệ thống “Xây dựng hệ thống quản lý và bán thực phẩm trực tuyến tích hợp gợi ý sản phẩm” được phát triển nhằm giải quyết các vấn đề trên. Hệ thống cho phép người dùng tìm kiếm, lựa chọn và đặt mua sản phẩm một cách thuận tiện, đồng thời hỗ trợ quản trị viên quản lý sản phẩm, đơn hàng và người dùng một cách hiệu quả.</w:t>
-      </w:r>
-    </w:p>
-    <w:p>
-      <w:pPr>
-        <w:spacing w:line="360" w:lineRule="auto"/>
-        <w:ind w:left="360"/>
-        <w:jc w:val="both"/>
-        <w:rPr>
-          <w:rFonts w:ascii="Times New Roman" w:hAnsi="Times New Roman" w:cs="Times New Roman"/>
-          <w:sz w:val="26"/>
-          <w:szCs w:val="26"/>
-          <w:lang w:val="en-US"/>
-        </w:rPr>
-      </w:pPr>
-      <w:r>
-        <w:rPr>
-          <w:rFonts w:ascii="Times New Roman" w:hAnsi="Times New Roman" w:cs="Times New Roman"/>
-          <w:sz w:val="26"/>
-          <w:szCs w:val="26"/>
-        </w:rPr>
-        <w:t>Ngoài ra, hệ thống tích hợp chức năng gợi ý sản phẩm nhằm nâng cao trải nghiệm người dùng và tăng hiệu quả kinh doanh.</w:t>
-      </w:r>
-    </w:p>
-    <w:p>
-      <w:pPr>
-        <w:pStyle w:val="oancuaDanhsach"/>
-        <w:numPr>
-          <w:ilvl w:val="0"/>
-          <w:numId w:val="1"/>
-        </w:numPr>
-        <w:spacing w:line="360" w:lineRule="auto"/>
-        <w:jc w:val="both"/>
+      </w:pPr>
+      <w:r>
         <w:rPr>
           <w:rFonts w:ascii="Times New Roman" w:hAnsi="Times New Roman" w:cs="Times New Roman"/>
           <w:b/>
@@ -137,8 +689,78 @@
           <w:szCs w:val="26"/>
           <w:lang w:val="en-US"/>
         </w:rPr>
-      </w:pPr>
-      <w:r>
+        <w:t>Giới thiệu</w:t>
+      </w:r>
+    </w:p>
+    <w:p>
+      <w:pPr>
+        <w:spacing w:line="360" w:lineRule="auto"/>
+        <w:ind w:left="360"/>
+        <w:jc w:val="both"/>
+        <w:rPr>
+          <w:rFonts w:ascii="Times New Roman" w:hAnsi="Times New Roman" w:cs="Times New Roman"/>
+          <w:sz w:val="26"/>
+          <w:szCs w:val="26"/>
+        </w:rPr>
+      </w:pPr>
+      <w:r>
+        <w:rPr>
+          <w:rFonts w:ascii="Times New Roman" w:hAnsi="Times New Roman" w:cs="Times New Roman"/>
+          <w:sz w:val="26"/>
+          <w:szCs w:val="26"/>
+        </w:rPr>
+        <w:t>Trong bối cảnh thương mại điện tử phát triển mạnh mẽ, nhu cầu mua sắm thực phẩm trực tuyến ngày càng gia tăng. Tuy nhiên, nhiều cửa hàng nhỏ lẻ vẫn chưa có hệ thống quản lý và bán hàng hiệu quả, gây khó khăn trong việc vận hành và tiếp cận khách hàng.</w:t>
+      </w:r>
+    </w:p>
+    <w:p>
+      <w:pPr>
+        <w:spacing w:line="360" w:lineRule="auto"/>
+        <w:ind w:left="360"/>
+        <w:jc w:val="both"/>
+        <w:rPr>
+          <w:rFonts w:ascii="Times New Roman" w:hAnsi="Times New Roman" w:cs="Times New Roman"/>
+          <w:sz w:val="26"/>
+          <w:szCs w:val="26"/>
+        </w:rPr>
+      </w:pPr>
+      <w:r>
+        <w:rPr>
+          <w:rFonts w:ascii="Times New Roman" w:hAnsi="Times New Roman" w:cs="Times New Roman"/>
+          <w:sz w:val="26"/>
+          <w:szCs w:val="26"/>
+        </w:rPr>
+        <w:t>Hệ thống “Xây dựng hệ thống quản lý và bán thực phẩm trực tuyến tích hợp gợi ý sản phẩm” được phát triển nhằm giải quyết các vấn đề trên. Hệ thống cho phép người dùng tìm kiếm, lựa chọn và đặt mua sản phẩm một cách thuận tiện, đồng thời hỗ trợ quản trị viên quản lý sản phẩm, đơn hàng và người dùng một cách hiệu quả.</w:t>
+      </w:r>
+    </w:p>
+    <w:p>
+      <w:pPr>
+        <w:spacing w:line="360" w:lineRule="auto"/>
+        <w:ind w:left="360"/>
+        <w:jc w:val="both"/>
+        <w:rPr>
+          <w:rFonts w:ascii="Times New Roman" w:hAnsi="Times New Roman" w:cs="Times New Roman"/>
+          <w:sz w:val="26"/>
+          <w:szCs w:val="26"/>
+        </w:rPr>
+      </w:pPr>
+      <w:r>
+        <w:rPr>
+          <w:rFonts w:ascii="Times New Roman" w:hAnsi="Times New Roman" w:cs="Times New Roman"/>
+          <w:sz w:val="26"/>
+          <w:szCs w:val="26"/>
+        </w:rPr>
+        <w:t>Ngoài ra, hệ thống tích hợp chức năng gợi ý sản phẩm nhằm nâng cao trải nghiệm người dùng và tăng hiệu quả kinh doanh.</w:t>
+      </w:r>
+    </w:p>
+    <w:p>
+      <w:pPr>
+        <w:pStyle w:val="oancuaDanhsach"/>
+        <w:numPr>
+          <w:ilvl w:val="0"/>
+          <w:numId w:val="1"/>
+        </w:numPr>
+        <w:spacing w:line="360" w:lineRule="auto"/>
+        <w:jc w:val="both"/>
         <w:rPr>
           <w:rFonts w:ascii="Times New Roman" w:hAnsi="Times New Roman" w:cs="Times New Roman"/>
           <w:b/>
@@ -147,300 +769,8 @@
           <w:szCs w:val="26"/>
           <w:lang w:val="en-US"/>
         </w:rPr>
-        <w:t>Mô tả tổng quan</w:t>
-      </w:r>
-    </w:p>
-    <w:p>
-      <w:pPr>
-        <w:spacing w:line="360" w:lineRule="auto"/>
-        <w:ind w:left="360"/>
-        <w:jc w:val="both"/>
-        <w:rPr>
-          <w:rFonts w:ascii="Times New Roman" w:hAnsi="Times New Roman" w:cs="Times New Roman"/>
-          <w:sz w:val="26"/>
-          <w:szCs w:val="26"/>
-        </w:rPr>
-      </w:pPr>
-      <w:r>
-        <w:rPr>
-          <w:rFonts w:ascii="Times New Roman" w:hAnsi="Times New Roman" w:cs="Times New Roman"/>
-          <w:sz w:val="26"/>
-          <w:szCs w:val="26"/>
-        </w:rPr>
-        <w:t>Qua quá trình khảo sát thực tế, có thể thấy rằng người dùng ngày càng có xu hướng mua sắm trực tuyến do tính tiện lợi và tiết kiệm thời gian. Tuy nhiên, việc tìm kiếm sản phẩm phù hợp vẫn còn hạn chế, đặc biệt đối với các hệ thống chưa có chức năng gợi ý.</w:t>
-      </w:r>
-    </w:p>
-    <w:p>
-      <w:pPr>
-        <w:spacing w:line="360" w:lineRule="auto"/>
-        <w:ind w:left="360"/>
-        <w:jc w:val="both"/>
-        <w:rPr>
-          <w:rFonts w:ascii="Times New Roman" w:hAnsi="Times New Roman" w:cs="Times New Roman"/>
-          <w:sz w:val="26"/>
-          <w:szCs w:val="26"/>
-        </w:rPr>
-      </w:pPr>
-      <w:r>
-        <w:rPr>
-          <w:rFonts w:ascii="Times New Roman" w:hAnsi="Times New Roman" w:cs="Times New Roman"/>
-          <w:sz w:val="26"/>
-          <w:szCs w:val="26"/>
-        </w:rPr>
-        <w:t>Đối với khách hàng, nhu cầu chính là:</w:t>
-      </w:r>
-    </w:p>
-    <w:p>
-      <w:pPr>
-        <w:pStyle w:val="oancuaDanhsach"/>
-        <w:numPr>
-          <w:ilvl w:val="0"/>
-          <w:numId w:val="2"/>
-        </w:numPr>
-        <w:spacing w:line="360" w:lineRule="auto"/>
-        <w:jc w:val="both"/>
-        <w:rPr>
-          <w:rFonts w:ascii="Times New Roman" w:hAnsi="Times New Roman" w:cs="Times New Roman"/>
-          <w:sz w:val="26"/>
-          <w:szCs w:val="26"/>
-          <w:lang w:val="en-US"/>
-        </w:rPr>
-      </w:pPr>
-      <w:r>
-        <w:rPr>
-          <w:rFonts w:ascii="Times New Roman" w:hAnsi="Times New Roman" w:cs="Times New Roman"/>
-          <w:sz w:val="26"/>
-          <w:szCs w:val="26"/>
-        </w:rPr>
-        <w:t>Tìm kiếm và lựa chọn sản phẩm nhanh chóng</w:t>
-      </w:r>
-    </w:p>
-    <w:p>
-      <w:pPr>
-        <w:pStyle w:val="oancuaDanhsach"/>
-        <w:numPr>
-          <w:ilvl w:val="0"/>
-          <w:numId w:val="2"/>
-        </w:numPr>
-        <w:spacing w:line="360" w:lineRule="auto"/>
-        <w:jc w:val="both"/>
-        <w:rPr>
-          <w:rFonts w:ascii="Times New Roman" w:hAnsi="Times New Roman" w:cs="Times New Roman"/>
-          <w:sz w:val="26"/>
-          <w:szCs w:val="26"/>
-          <w:lang w:val="en-US"/>
-        </w:rPr>
-      </w:pPr>
-      <w:r>
-        <w:rPr>
-          <w:rFonts w:ascii="Times New Roman" w:hAnsi="Times New Roman" w:cs="Times New Roman"/>
-          <w:sz w:val="26"/>
-          <w:szCs w:val="26"/>
-        </w:rPr>
-        <w:t>Xem thông tin sản phẩm rõ ràng</w:t>
-      </w:r>
-    </w:p>
-    <w:p>
-      <w:pPr>
-        <w:pStyle w:val="oancuaDanhsach"/>
-        <w:numPr>
-          <w:ilvl w:val="0"/>
-          <w:numId w:val="2"/>
-        </w:numPr>
-        <w:spacing w:line="360" w:lineRule="auto"/>
-        <w:jc w:val="both"/>
-        <w:rPr>
-          <w:rFonts w:ascii="Times New Roman" w:hAnsi="Times New Roman" w:cs="Times New Roman"/>
-          <w:sz w:val="26"/>
-          <w:szCs w:val="26"/>
-          <w:lang w:val="en-US"/>
-        </w:rPr>
-      </w:pPr>
-      <w:r>
-        <w:rPr>
-          <w:rFonts w:ascii="Times New Roman" w:hAnsi="Times New Roman" w:cs="Times New Roman"/>
-          <w:sz w:val="26"/>
-          <w:szCs w:val="26"/>
-        </w:rPr>
-        <w:t>Xem thông tin sản phẩm rõ ràng</w:t>
-      </w:r>
-    </w:p>
-    <w:p>
-      <w:pPr>
-        <w:pStyle w:val="oancuaDanhsach"/>
-        <w:numPr>
-          <w:ilvl w:val="0"/>
-          <w:numId w:val="2"/>
-        </w:numPr>
-        <w:spacing w:line="360" w:lineRule="auto"/>
-        <w:jc w:val="both"/>
-        <w:rPr>
-          <w:rFonts w:ascii="Times New Roman" w:hAnsi="Times New Roman" w:cs="Times New Roman"/>
-          <w:sz w:val="26"/>
-          <w:szCs w:val="26"/>
-          <w:lang w:val="en-US"/>
-        </w:rPr>
-      </w:pPr>
-      <w:r>
-        <w:rPr>
-          <w:rFonts w:ascii="Times New Roman" w:hAnsi="Times New Roman" w:cs="Times New Roman"/>
-          <w:sz w:val="26"/>
-          <w:szCs w:val="26"/>
-        </w:rPr>
-        <w:t>Nhận được gợi ý sản phẩm phù hợp</w:t>
-      </w:r>
-    </w:p>
-    <w:p>
-      <w:pPr>
-        <w:spacing w:line="360" w:lineRule="auto"/>
-        <w:ind w:firstLine="360"/>
-        <w:jc w:val="both"/>
-        <w:rPr>
-          <w:rFonts w:ascii="Times New Roman" w:hAnsi="Times New Roman" w:cs="Times New Roman"/>
-          <w:sz w:val="26"/>
-          <w:szCs w:val="26"/>
-          <w:lang w:val="en-US"/>
-        </w:rPr>
-      </w:pPr>
-      <w:r>
-        <w:rPr>
-          <w:rFonts w:ascii="Times New Roman" w:hAnsi="Times New Roman" w:cs="Times New Roman"/>
-          <w:sz w:val="26"/>
-          <w:szCs w:val="26"/>
-        </w:rPr>
-        <w:t>Đối với quản trị viên, hệ thống cần:</w:t>
-      </w:r>
-    </w:p>
-    <w:p>
-      <w:pPr>
-        <w:pStyle w:val="oancuaDanhsach"/>
-        <w:numPr>
-          <w:ilvl w:val="0"/>
-          <w:numId w:val="5"/>
-        </w:numPr>
-        <w:spacing w:line="360" w:lineRule="auto"/>
-        <w:jc w:val="both"/>
-        <w:rPr>
-          <w:rFonts w:ascii="Times New Roman" w:hAnsi="Times New Roman" w:cs="Times New Roman"/>
-          <w:sz w:val="26"/>
-          <w:szCs w:val="26"/>
-          <w:lang w:val="en-US"/>
-        </w:rPr>
-      </w:pPr>
-      <w:r>
-        <w:rPr>
-          <w:rFonts w:ascii="Times New Roman" w:hAnsi="Times New Roman" w:cs="Times New Roman"/>
-          <w:sz w:val="26"/>
-          <w:szCs w:val="26"/>
-        </w:rPr>
-        <w:t>Đối với quản trị viên, hệ thống cần:</w:t>
-      </w:r>
-    </w:p>
-    <w:p>
-      <w:pPr>
-        <w:pStyle w:val="oancuaDanhsach"/>
-        <w:numPr>
-          <w:ilvl w:val="0"/>
-          <w:numId w:val="5"/>
-        </w:numPr>
-        <w:spacing w:line="360" w:lineRule="auto"/>
-        <w:jc w:val="both"/>
-        <w:rPr>
-          <w:rFonts w:ascii="Times New Roman" w:hAnsi="Times New Roman" w:cs="Times New Roman"/>
-          <w:sz w:val="26"/>
-          <w:szCs w:val="26"/>
-          <w:lang w:val="en-US"/>
-        </w:rPr>
-      </w:pPr>
-      <w:r>
-        <w:rPr>
-          <w:rFonts w:ascii="Times New Roman" w:hAnsi="Times New Roman" w:cs="Times New Roman"/>
-          <w:sz w:val="26"/>
-          <w:szCs w:val="26"/>
-        </w:rPr>
-        <w:t>Quản lý đơn hàng</w:t>
-      </w:r>
-    </w:p>
-    <w:p>
-      <w:pPr>
-        <w:pStyle w:val="oancuaDanhsach"/>
-        <w:numPr>
-          <w:ilvl w:val="0"/>
-          <w:numId w:val="5"/>
-        </w:numPr>
-        <w:spacing w:line="360" w:lineRule="auto"/>
-        <w:jc w:val="both"/>
-        <w:rPr>
-          <w:rFonts w:ascii="Times New Roman" w:hAnsi="Times New Roman" w:cs="Times New Roman"/>
-          <w:sz w:val="26"/>
-          <w:szCs w:val="26"/>
-          <w:lang w:val="en-US"/>
-        </w:rPr>
-      </w:pPr>
-      <w:r>
-        <w:rPr>
-          <w:rFonts w:ascii="Times New Roman" w:hAnsi="Times New Roman" w:cs="Times New Roman"/>
-          <w:sz w:val="26"/>
-          <w:szCs w:val="26"/>
-        </w:rPr>
-        <w:t>Quản lý đơn hàng</w:t>
-      </w:r>
-    </w:p>
-    <w:p>
-      <w:pPr>
-        <w:pStyle w:val="oancuaDanhsach"/>
-        <w:numPr>
-          <w:ilvl w:val="0"/>
-          <w:numId w:val="5"/>
-        </w:numPr>
-        <w:spacing w:line="360" w:lineRule="auto"/>
-        <w:jc w:val="both"/>
-        <w:rPr>
-          <w:rFonts w:ascii="Times New Roman" w:hAnsi="Times New Roman" w:cs="Times New Roman"/>
-          <w:sz w:val="26"/>
-          <w:szCs w:val="26"/>
-          <w:lang w:val="en-US"/>
-        </w:rPr>
-      </w:pPr>
-      <w:r>
-        <w:rPr>
-          <w:rFonts w:ascii="Times New Roman" w:hAnsi="Times New Roman" w:cs="Times New Roman"/>
-          <w:sz w:val="26"/>
-          <w:szCs w:val="26"/>
-        </w:rPr>
-        <w:t>Theo dõi doanh thu và hoạt động kinh doanh</w:t>
-      </w:r>
-    </w:p>
-    <w:p>
-      <w:pPr>
-        <w:pStyle w:val="ThngthngWeb"/>
-        <w:spacing w:line="360" w:lineRule="auto"/>
-        <w:ind w:left="360"/>
-        <w:jc w:val="both"/>
-        <w:rPr>
-          <w:sz w:val="26"/>
-          <w:szCs w:val="26"/>
-          <w:lang w:val="en-US"/>
-        </w:rPr>
-      </w:pPr>
-      <w:r>
-        <w:rPr>
-          <w:sz w:val="26"/>
-          <w:szCs w:val="26"/>
-        </w:rPr>
-        <w:lastRenderedPageBreak/>
-        <w:t>Từ các nhu cầu trên, hệ thống được thiết kế với các chức năng chính bao gồm: bán hàng trực tuyến, quản lý dữ liệu và gợi ý sản phẩm. Ngoài ra, hệ thống còn cung cấp dashboard để hỗ trợ việc thống kê và ra quyết định.</w:t>
-      </w:r>
-    </w:p>
-    <w:p>
-      <w:pPr>
-        <w:pStyle w:val="oancuaDanhsach"/>
-        <w:numPr>
-          <w:ilvl w:val="0"/>
-          <w:numId w:val="1"/>
-        </w:numPr>
-        <w:spacing w:line="360" w:lineRule="auto"/>
-        <w:jc w:val="both"/>
+      </w:pPr>
+      <w:r>
         <w:rPr>
           <w:rFonts w:ascii="Times New Roman" w:hAnsi="Times New Roman" w:cs="Times New Roman"/>
           <w:b/>
@@ -449,8 +779,298 @@
           <w:szCs w:val="26"/>
           <w:lang w:val="en-US"/>
         </w:rPr>
-      </w:pPr>
-      <w:r>
+        <w:t>Mô tả tổng quan</w:t>
+      </w:r>
+    </w:p>
+    <w:p>
+      <w:pPr>
+        <w:spacing w:line="360" w:lineRule="auto"/>
+        <w:ind w:left="360"/>
+        <w:jc w:val="both"/>
+        <w:rPr>
+          <w:rFonts w:ascii="Times New Roman" w:hAnsi="Times New Roman" w:cs="Times New Roman"/>
+          <w:sz w:val="26"/>
+          <w:szCs w:val="26"/>
+        </w:rPr>
+      </w:pPr>
+      <w:r>
+        <w:rPr>
+          <w:rFonts w:ascii="Times New Roman" w:hAnsi="Times New Roman" w:cs="Times New Roman"/>
+          <w:sz w:val="26"/>
+          <w:szCs w:val="26"/>
+        </w:rPr>
+        <w:t>Qua quá trình khảo sát thực tế, có thể thấy rằng người dùng ngày càng có xu hướng mua sắm trực tuyến do tính tiện lợi và tiết kiệm thời gian. Tuy nhiên, việc tìm kiếm sản phẩm phù hợp vẫn còn hạn chế, đặc biệt đối với các hệ thống chưa có chức năng gợi ý.</w:t>
+      </w:r>
+    </w:p>
+    <w:p>
+      <w:pPr>
+        <w:spacing w:line="360" w:lineRule="auto"/>
+        <w:ind w:left="360"/>
+        <w:jc w:val="both"/>
+        <w:rPr>
+          <w:rFonts w:ascii="Times New Roman" w:hAnsi="Times New Roman" w:cs="Times New Roman"/>
+          <w:sz w:val="26"/>
+          <w:szCs w:val="26"/>
+        </w:rPr>
+      </w:pPr>
+      <w:r>
+        <w:rPr>
+          <w:rFonts w:ascii="Times New Roman" w:hAnsi="Times New Roman" w:cs="Times New Roman"/>
+          <w:sz w:val="26"/>
+          <w:szCs w:val="26"/>
+        </w:rPr>
+        <w:t>Đối với khách hàng, nhu cầu chính là:</w:t>
+      </w:r>
+    </w:p>
+    <w:p>
+      <w:pPr>
+        <w:pStyle w:val="oancuaDanhsach"/>
+        <w:numPr>
+          <w:ilvl w:val="0"/>
+          <w:numId w:val="2"/>
+        </w:numPr>
+        <w:spacing w:line="360" w:lineRule="auto"/>
+        <w:jc w:val="both"/>
+        <w:rPr>
+          <w:rFonts w:ascii="Times New Roman" w:hAnsi="Times New Roman" w:cs="Times New Roman"/>
+          <w:sz w:val="26"/>
+          <w:szCs w:val="26"/>
+        </w:rPr>
+      </w:pPr>
+      <w:r>
+        <w:rPr>
+          <w:rFonts w:ascii="Times New Roman" w:hAnsi="Times New Roman" w:cs="Times New Roman"/>
+          <w:sz w:val="26"/>
+          <w:szCs w:val="26"/>
+        </w:rPr>
+        <w:t>Tìm kiếm và lựa chọn sản phẩm nhanh chóng</w:t>
+      </w:r>
+    </w:p>
+    <w:p>
+      <w:pPr>
+        <w:pStyle w:val="oancuaDanhsach"/>
+        <w:numPr>
+          <w:ilvl w:val="0"/>
+          <w:numId w:val="2"/>
+        </w:numPr>
+        <w:spacing w:line="360" w:lineRule="auto"/>
+        <w:jc w:val="both"/>
+        <w:rPr>
+          <w:rFonts w:ascii="Times New Roman" w:hAnsi="Times New Roman" w:cs="Times New Roman"/>
+          <w:sz w:val="26"/>
+          <w:szCs w:val="26"/>
+          <w:lang w:val="en-US"/>
+        </w:rPr>
+      </w:pPr>
+      <w:r>
+        <w:rPr>
+          <w:rFonts w:ascii="Times New Roman" w:hAnsi="Times New Roman" w:cs="Times New Roman"/>
+          <w:sz w:val="26"/>
+          <w:szCs w:val="26"/>
+        </w:rPr>
+        <w:t>Xem thông tin sản phẩm rõ ràng</w:t>
+      </w:r>
+    </w:p>
+    <w:p>
+      <w:pPr>
+        <w:pStyle w:val="oancuaDanhsach"/>
+        <w:numPr>
+          <w:ilvl w:val="0"/>
+          <w:numId w:val="2"/>
+        </w:numPr>
+        <w:spacing w:line="360" w:lineRule="auto"/>
+        <w:jc w:val="both"/>
+        <w:rPr>
+          <w:rFonts w:ascii="Times New Roman" w:hAnsi="Times New Roman" w:cs="Times New Roman"/>
+          <w:sz w:val="26"/>
+          <w:szCs w:val="26"/>
+          <w:lang w:val="en-US"/>
+        </w:rPr>
+      </w:pPr>
+      <w:r>
+        <w:rPr>
+          <w:rFonts w:ascii="Times New Roman" w:hAnsi="Times New Roman" w:cs="Times New Roman"/>
+          <w:sz w:val="26"/>
+          <w:szCs w:val="26"/>
+        </w:rPr>
+        <w:t>Xem thông tin sản phẩm rõ ràng</w:t>
+      </w:r>
+    </w:p>
+    <w:p>
+      <w:pPr>
+        <w:pStyle w:val="oancuaDanhsach"/>
+        <w:numPr>
+          <w:ilvl w:val="0"/>
+          <w:numId w:val="2"/>
+        </w:numPr>
+        <w:spacing w:line="360" w:lineRule="auto"/>
+        <w:jc w:val="both"/>
+        <w:rPr>
+          <w:rFonts w:ascii="Times New Roman" w:hAnsi="Times New Roman" w:cs="Times New Roman"/>
+          <w:sz w:val="26"/>
+          <w:szCs w:val="26"/>
+          <w:lang w:val="en-US"/>
+        </w:rPr>
+      </w:pPr>
+      <w:r>
+        <w:rPr>
+          <w:rFonts w:ascii="Times New Roman" w:hAnsi="Times New Roman" w:cs="Times New Roman"/>
+          <w:sz w:val="26"/>
+          <w:szCs w:val="26"/>
+        </w:rPr>
+        <w:t>Nhận được gợi ý sản phẩm phù hợp</w:t>
+      </w:r>
+    </w:p>
+    <w:p>
+      <w:pPr>
+        <w:spacing w:line="360" w:lineRule="auto"/>
+        <w:ind w:firstLine="360"/>
+        <w:jc w:val="both"/>
+        <w:rPr>
+          <w:rFonts w:ascii="Times New Roman" w:hAnsi="Times New Roman" w:cs="Times New Roman"/>
+          <w:sz w:val="26"/>
+          <w:szCs w:val="26"/>
+          <w:lang w:val="en-US"/>
+        </w:rPr>
+      </w:pPr>
+      <w:r>
+        <w:rPr>
+          <w:rFonts w:ascii="Times New Roman" w:hAnsi="Times New Roman" w:cs="Times New Roman"/>
+          <w:sz w:val="26"/>
+          <w:szCs w:val="26"/>
+        </w:rPr>
+        <w:t>Đối với quản trị viên, hệ thống cần:</w:t>
+      </w:r>
+    </w:p>
+    <w:p>
+      <w:pPr>
+        <w:pStyle w:val="oancuaDanhsach"/>
+        <w:numPr>
+          <w:ilvl w:val="0"/>
+          <w:numId w:val="5"/>
+        </w:numPr>
+        <w:spacing w:line="360" w:lineRule="auto"/>
+        <w:jc w:val="both"/>
+        <w:rPr>
+          <w:rFonts w:ascii="Times New Roman" w:hAnsi="Times New Roman" w:cs="Times New Roman"/>
+          <w:sz w:val="26"/>
+          <w:szCs w:val="26"/>
+          <w:lang w:val="en-US"/>
+        </w:rPr>
+      </w:pPr>
+      <w:r>
+        <w:rPr>
+          <w:rFonts w:ascii="Times New Roman" w:hAnsi="Times New Roman" w:cs="Times New Roman"/>
+          <w:sz w:val="26"/>
+          <w:szCs w:val="26"/>
+        </w:rPr>
+        <w:t>Đối với quản trị viên, hệ thống cần:</w:t>
+      </w:r>
+    </w:p>
+    <w:p>
+      <w:pPr>
+        <w:pStyle w:val="oancuaDanhsach"/>
+        <w:numPr>
+          <w:ilvl w:val="0"/>
+          <w:numId w:val="5"/>
+        </w:numPr>
+        <w:spacing w:line="360" w:lineRule="auto"/>
+        <w:jc w:val="both"/>
+        <w:rPr>
+          <w:rFonts w:ascii="Times New Roman" w:hAnsi="Times New Roman" w:cs="Times New Roman"/>
+          <w:sz w:val="26"/>
+          <w:szCs w:val="26"/>
+          <w:lang w:val="en-US"/>
+        </w:rPr>
+      </w:pPr>
+      <w:r>
+        <w:rPr>
+          <w:rFonts w:ascii="Times New Roman" w:hAnsi="Times New Roman" w:cs="Times New Roman"/>
+          <w:sz w:val="26"/>
+          <w:szCs w:val="26"/>
+        </w:rPr>
+        <w:t>Quản lý đơn hàng</w:t>
+      </w:r>
+    </w:p>
+    <w:p>
+      <w:pPr>
+        <w:pStyle w:val="oancuaDanhsach"/>
+        <w:numPr>
+          <w:ilvl w:val="0"/>
+          <w:numId w:val="5"/>
+        </w:numPr>
+        <w:spacing w:line="360" w:lineRule="auto"/>
+        <w:jc w:val="both"/>
+        <w:rPr>
+          <w:rFonts w:ascii="Times New Roman" w:hAnsi="Times New Roman" w:cs="Times New Roman"/>
+          <w:sz w:val="26"/>
+          <w:szCs w:val="26"/>
+          <w:lang w:val="en-US"/>
+        </w:rPr>
+      </w:pPr>
+      <w:r>
+        <w:rPr>
+          <w:rFonts w:ascii="Times New Roman" w:hAnsi="Times New Roman" w:cs="Times New Roman"/>
+          <w:sz w:val="26"/>
+          <w:szCs w:val="26"/>
+        </w:rPr>
+        <w:t>Quản lý đơn hàng</w:t>
+      </w:r>
+    </w:p>
+    <w:p>
+      <w:pPr>
+        <w:pStyle w:val="oancuaDanhsach"/>
+        <w:numPr>
+          <w:ilvl w:val="0"/>
+          <w:numId w:val="5"/>
+        </w:numPr>
+        <w:spacing w:line="360" w:lineRule="auto"/>
+        <w:jc w:val="both"/>
+        <w:rPr>
+          <w:rFonts w:ascii="Times New Roman" w:hAnsi="Times New Roman" w:cs="Times New Roman"/>
+          <w:sz w:val="26"/>
+          <w:szCs w:val="26"/>
+          <w:lang w:val="en-US"/>
+        </w:rPr>
+      </w:pPr>
+      <w:r>
+        <w:rPr>
+          <w:rFonts w:ascii="Times New Roman" w:hAnsi="Times New Roman" w:cs="Times New Roman"/>
+          <w:sz w:val="26"/>
+          <w:szCs w:val="26"/>
+        </w:rPr>
+        <w:lastRenderedPageBreak/>
+        <w:t>Theo dõi doanh thu và hoạt động kinh doanh</w:t>
+      </w:r>
+    </w:p>
+    <w:p>
+      <w:pPr>
+        <w:pStyle w:val="ThngthngWeb"/>
+        <w:spacing w:line="360" w:lineRule="auto"/>
+        <w:ind w:left="360"/>
+        <w:jc w:val="both"/>
+        <w:rPr>
+          <w:sz w:val="26"/>
+          <w:szCs w:val="26"/>
+        </w:rPr>
+      </w:pPr>
+      <w:r>
+        <w:rPr>
+          <w:sz w:val="26"/>
+          <w:szCs w:val="26"/>
+        </w:rPr>
+        <w:t>Từ các nhu cầu trên, hệ thống được thiết kế với các chức năng chính bao gồm: bán hàng trực tuyến, quản lý dữ liệu và gợi ý sản phẩm. Ngoài ra, hệ thống còn cung cấp dashboard để hỗ trợ việc thống kê và ra quyết định.</w:t>
+      </w:r>
+    </w:p>
+    <w:p>
+      <w:pPr>
+        <w:pStyle w:val="oancuaDanhsach"/>
+        <w:numPr>
+          <w:ilvl w:val="0"/>
+          <w:numId w:val="1"/>
+        </w:numPr>
+        <w:spacing w:line="360" w:lineRule="auto"/>
+        <w:jc w:val="both"/>
         <w:rPr>
           <w:rFonts w:ascii="Times New Roman" w:hAnsi="Times New Roman" w:cs="Times New Roman"/>
           <w:b/>
@@ -459,45 +1079,6 @@
           <w:szCs w:val="26"/>
           <w:lang w:val="en-US"/>
         </w:rPr>
-        <w:t>Yêu cầu chức năng</w:t>
-      </w:r>
-    </w:p>
-    <w:p>
-      <w:pPr>
-        <w:spacing w:line="360" w:lineRule="auto"/>
-        <w:ind w:left="360"/>
-        <w:jc w:val="both"/>
-        <w:rPr>
-          <w:rFonts w:ascii="Times New Roman" w:hAnsi="Times New Roman" w:cs="Times New Roman"/>
-          <w:sz w:val="26"/>
-          <w:szCs w:val="26"/>
-          <w:lang w:val="en-US"/>
-        </w:rPr>
-      </w:pPr>
-      <w:r>
-        <w:rPr>
-          <w:rFonts w:ascii="Times New Roman" w:hAnsi="Times New Roman" w:cs="Times New Roman"/>
-          <w:sz w:val="26"/>
-          <w:szCs w:val="26"/>
-        </w:rPr>
-        <w:t>Hệ thống cần cung cấp đầy đủ các chức năng nhằm đáp ứng nhu cầu của người dùng và quản trị viên.</w:t>
-      </w:r>
-    </w:p>
-    <w:p>
-      <w:pPr>
-        <w:pStyle w:val="oancuaDanhsach"/>
-        <w:numPr>
-          <w:ilvl w:val="0"/>
-          <w:numId w:val="6"/>
-        </w:numPr>
-        <w:spacing w:line="360" w:lineRule="auto"/>
-        <w:jc w:val="both"/>
-        <w:rPr>
-          <w:rFonts w:ascii="Times New Roman" w:hAnsi="Times New Roman" w:cs="Times New Roman"/>
-          <w:sz w:val="26"/>
-          <w:szCs w:val="26"/>
-          <w:lang w:val="en-US"/>
-        </w:rPr>
       </w:pPr>
       <w:r>
         <w:rPr>
@@ -506,9 +1087,48 @@
           <w:bCs/>
           <w:sz w:val="26"/>
           <w:szCs w:val="26"/>
-        </w:rPr>
-        <w:t>Đối với khách hàng</w:t>
-      </w:r>
+          <w:lang w:val="en-US"/>
+        </w:rPr>
+        <w:t>Yêu cầu chức năng</w:t>
+      </w:r>
+    </w:p>
+    <w:p>
+      <w:pPr>
+        <w:spacing w:line="360" w:lineRule="auto"/>
+        <w:ind w:left="360"/>
+        <w:jc w:val="both"/>
+        <w:rPr>
+          <w:rFonts w:ascii="Times New Roman" w:hAnsi="Times New Roman" w:cs="Times New Roman"/>
+          <w:sz w:val="26"/>
+          <w:szCs w:val="26"/>
+          <w:lang w:val="en-US"/>
+        </w:rPr>
+      </w:pPr>
+      <w:r>
+        <w:rPr>
+          <w:rFonts w:ascii="Times New Roman" w:hAnsi="Times New Roman" w:cs="Times New Roman"/>
+          <w:sz w:val="26"/>
+          <w:szCs w:val="26"/>
+        </w:rPr>
+        <w:t>Hệ thống cần cung cấp đầy đủ các chức năng nhằm đáp ứng nhu cầu của người dùng và quản trị viên.</w:t>
+      </w:r>
+    </w:p>
+    <w:p>
+      <w:pPr>
+        <w:pStyle w:val="oancuaDanhsach"/>
+        <w:numPr>
+          <w:ilvl w:val="0"/>
+          <w:numId w:val="6"/>
+        </w:numPr>
+        <w:spacing w:line="360" w:lineRule="auto"/>
+        <w:jc w:val="both"/>
+        <w:rPr>
+          <w:rFonts w:ascii="Times New Roman" w:hAnsi="Times New Roman" w:cs="Times New Roman"/>
+          <w:sz w:val="26"/>
+          <w:szCs w:val="26"/>
+          <w:lang w:val="en-US"/>
+        </w:rPr>
+      </w:pPr>
       <w:r>
         <w:rPr>
           <w:rFonts w:ascii="Times New Roman" w:hAnsi="Times New Roman" w:cs="Times New Roman"/>
@@ -516,6 +1136,16 @@
           <w:bCs/>
           <w:sz w:val="26"/>
           <w:szCs w:val="26"/>
+        </w:rPr>
+        <w:t>Đối với khách hàng</w:t>
+      </w:r>
+      <w:r>
+        <w:rPr>
+          <w:rFonts w:ascii="Times New Roman" w:hAnsi="Times New Roman" w:cs="Times New Roman"/>
+          <w:b/>
+          <w:bCs/>
+          <w:sz w:val="26"/>
+          <w:szCs w:val="26"/>
           <w:lang w:val="en-US"/>
         </w:rPr>
         <w:t xml:space="preserve">: </w:t>
@@ -551,7 +1181,7 @@
           <w:sz w:val="26"/>
           <w:szCs w:val="26"/>
         </w:rPr>
-        <w:t>Hệ thống cho phép khách hàng thực hiện các chức năng sau:</w:t>
+        <w:t>Đăng ký và đăng nhập tài khoản để sử dụng hệ thống</w:t>
       </w:r>
     </w:p>
     <w:p>
@@ -1030,6 +1660,7 @@
           <w:sz w:val="26"/>
           <w:szCs w:val="26"/>
         </w:rPr>
+        <w:lastRenderedPageBreak/>
         <w:t>Người dùng truy cập danh sách sản phẩm</w:t>
       </w:r>
     </w:p>
@@ -1055,7 +1686,6 @@
           <w:sz w:val="26"/>
           <w:szCs w:val="26"/>
         </w:rPr>
-        <w:lastRenderedPageBreak/>
         <w:t>Lựa chọn sản phẩm và thêm vào giỏ hàng</w:t>
       </w:r>
     </w:p>
@@ -1609,6 +2239,7 @@
           <w:sz w:val="26"/>
           <w:szCs w:val="26"/>
         </w:rPr>
+        <w:lastRenderedPageBreak/>
         <w:t>Độ tin cậy: Hệ thống hoạt động ổn định, hạn chế lỗi và đảm bảo dữ liệu không bị mất</w:t>
       </w:r>
     </w:p>
@@ -1634,9 +2265,415 @@
           <w:sz w:val="26"/>
           <w:szCs w:val="26"/>
         </w:rPr>
+        <w:t>Khả năng mở rộng: Có thể nâng cấp thêm các chức năng như thanh toán online hoặc ứng dụng mobile trong tương lai</w:t>
+      </w:r>
+    </w:p>
+    <w:p>
+      <w:pPr>
+        <w:pStyle w:val="oancuaDanhsach"/>
+        <w:numPr>
+          <w:ilvl w:val="0"/>
+          <w:numId w:val="1"/>
+        </w:numPr>
+        <w:spacing w:line="360" w:lineRule="auto"/>
+        <w:jc w:val="both"/>
+        <w:rPr>
+          <w:rFonts w:ascii="Times New Roman" w:hAnsi="Times New Roman" w:cs="Times New Roman"/>
+          <w:b/>
+          <w:bCs/>
+          <w:sz w:val="26"/>
+          <w:szCs w:val="26"/>
+          <w:lang w:val="en-US"/>
+        </w:rPr>
+      </w:pPr>
+      <w:r>
+        <w:rPr>
+          <w:rFonts w:ascii="Times New Roman" w:hAnsi="Times New Roman" w:cs="Times New Roman"/>
+          <w:b/>
+          <w:bCs/>
+          <w:sz w:val="26"/>
+          <w:szCs w:val="26"/>
+          <w:lang w:val="en-US"/>
+        </w:rPr>
+        <w:t>Sơ đồ Use</w:t>
+      </w:r>
+      <w:r>
+        <w:rPr>
+          <w:rFonts w:ascii="Times New Roman" w:hAnsi="Times New Roman" w:cs="Times New Roman"/>
+          <w:b/>
+          <w:bCs/>
+          <w:sz w:val="26"/>
+          <w:szCs w:val="26"/>
+          <w:lang w:val="en-US"/>
+        </w:rPr>
+        <w:t xml:space="preserve"> C</w:t>
+      </w:r>
+      <w:r>
+        <w:rPr>
+          <w:rFonts w:ascii="Times New Roman" w:hAnsi="Times New Roman" w:cs="Times New Roman"/>
+          <w:b/>
+          <w:bCs/>
+          <w:sz w:val="26"/>
+          <w:szCs w:val="26"/>
+          <w:lang w:val="en-US"/>
+        </w:rPr>
+        <w:t>ase tổng quan</w:t>
+      </w:r>
+    </w:p>
+    <w:p>
+      <w:pPr>
+        <w:pStyle w:val="oancuaDanhsach"/>
+        <w:spacing w:line="360" w:lineRule="auto"/>
+        <w:jc w:val="both"/>
+        <w:rPr>
+          <w:rFonts w:ascii="Times New Roman" w:hAnsi="Times New Roman" w:cs="Times New Roman"/>
+          <w:sz w:val="26"/>
+          <w:szCs w:val="26"/>
+          <w:lang w:val="en-US"/>
+        </w:rPr>
+      </w:pPr>
+      <w:r>
+        <w:rPr>
+          <w:rFonts w:ascii="Times New Roman" w:hAnsi="Times New Roman" w:cs="Times New Roman"/>
+          <w:noProof/>
+          <w:sz w:val="26"/>
+          <w:szCs w:val="26"/>
+          <w:lang w:val="en-US"/>
+        </w:rPr>
+        <w:drawing>
+          <wp:inline distT="0" distB="0" distL="0" distR="0" wp14:anchorId="02F933E3" wp14:editId="5D9E3BCB">
+            <wp:extent cx="5943600" cy="3933825"/>
+            <wp:effectExtent l="0" t="0" r="0" b="9525"/>
+            <wp:docPr id="178867302" name="Hình ảnh 1"/>
+            <wp:cNvGraphicFramePr>
+              <a:graphicFrameLocks xmlns:a="http://schemas.openxmlformats.org/drawingml/2006/main" noChangeAspect="1"/>
+            </wp:cNvGraphicFramePr>
+            <a:graphic xmlns:a="http://schemas.openxmlformats.org/drawingml/2006/main">
+              <a:graphicData uri="http://schemas.openxmlformats.org/drawingml/2006/picture">
+                <pic:pic xmlns:pic="http://schemas.openxmlformats.org/drawingml/2006/picture">
+                  <pic:nvPicPr>
+                    <pic:cNvPr id="0" name="Picture 1"/>
+                    <pic:cNvPicPr>
+                      <a:picLocks noChangeAspect="1" noChangeArrowheads="1"/>
+                    </pic:cNvPicPr>
+                  </pic:nvPicPr>
+                  <pic:blipFill>
+                    <a:blip r:embed="rId6">
+                      <a:extLst>
+                        <a:ext uri="{28A0092B-C50C-407E-A947-70E740481C1C}">
+                          <a14:useLocalDpi xmlns:a14="http://schemas.microsoft.com/office/drawing/2010/main" val="0"/>
+                        </a:ext>
+                      </a:extLst>
+                    </a:blip>
+                    <a:srcRect/>
+                    <a:stretch>
+                      <a:fillRect/>
+                    </a:stretch>
+                  </pic:blipFill>
+                  <pic:spPr bwMode="auto">
+                    <a:xfrm>
+                      <a:off x="0" y="0"/>
+                      <a:ext cx="5943600" cy="3933825"/>
+                    </a:xfrm>
+                    <a:prstGeom prst="rect">
+                      <a:avLst/>
+                    </a:prstGeom>
+                    <a:noFill/>
+                    <a:ln>
+                      <a:noFill/>
+                    </a:ln>
+                  </pic:spPr>
+                </pic:pic>
+              </a:graphicData>
+            </a:graphic>
+          </wp:inline>
+        </w:drawing>
+      </w:r>
+    </w:p>
+    <w:p>
+      <w:pPr>
+        <w:spacing w:line="360" w:lineRule="auto"/>
+        <w:jc w:val="both"/>
+        <w:rPr>
+          <w:rFonts w:ascii="Times New Roman" w:hAnsi="Times New Roman" w:cs="Times New Roman"/>
+          <w:sz w:val="26"/>
+          <w:szCs w:val="26"/>
+          <w:lang w:val="en-US"/>
+        </w:rPr>
+      </w:pPr>
+      <w:r>
+        <w:rPr>
+          <w:rFonts w:ascii="Times New Roman" w:hAnsi="Times New Roman" w:cs="Times New Roman"/>
+          <w:sz w:val="26"/>
+          <w:szCs w:val="26"/>
+        </w:rPr>
+        <w:t>Sơ đồ Use Case mô tả các tác nhân (actor) và các chức năng chính mà hệ thống cung cấp, thể hiện cách người dùng tương tác với hệ thống bán thực phẩm trực tuyến.</w:t>
+      </w:r>
+    </w:p>
+    <w:p>
+      <w:pPr>
+        <w:spacing w:line="360" w:lineRule="auto"/>
+        <w:jc w:val="both"/>
+        <w:rPr>
+          <w:rFonts w:ascii="Times New Roman" w:hAnsi="Times New Roman" w:cs="Times New Roman"/>
+          <w:sz w:val="26"/>
+          <w:szCs w:val="26"/>
+          <w:lang w:val="en-US"/>
+        </w:rPr>
+      </w:pPr>
+      <w:r>
+        <w:rPr>
+          <w:rFonts w:ascii="Times New Roman" w:hAnsi="Times New Roman" w:cs="Times New Roman"/>
+          <w:sz w:val="26"/>
+          <w:szCs w:val="26"/>
+        </w:rPr>
+        <w:t>Trong hệ thống có hai tác nhân chính:</w:t>
+      </w:r>
+    </w:p>
+    <w:p>
+      <w:pPr>
+        <w:pStyle w:val="oancuaDanhsach"/>
+        <w:numPr>
+          <w:ilvl w:val="0"/>
+          <w:numId w:val="15"/>
+        </w:numPr>
+        <w:spacing w:line="360" w:lineRule="auto"/>
+        <w:jc w:val="both"/>
+        <w:rPr>
+          <w:rFonts w:ascii="Times New Roman" w:hAnsi="Times New Roman" w:cs="Times New Roman"/>
+          <w:sz w:val="26"/>
+          <w:szCs w:val="26"/>
+          <w:lang w:val="en-US"/>
+        </w:rPr>
+      </w:pPr>
+      <w:r>
+        <w:rPr>
+          <w:rFonts w:ascii="Times New Roman" w:hAnsi="Times New Roman" w:cs="Times New Roman"/>
+          <w:sz w:val="26"/>
+          <w:szCs w:val="26"/>
+        </w:rPr>
+        <w:t>Khách hàng (User): là người sử dụng hệ thống để tìm kiếm và mua sản phẩm.</w:t>
+      </w:r>
+    </w:p>
+    <w:p>
+      <w:pPr>
+        <w:pStyle w:val="oancuaDanhsach"/>
+        <w:numPr>
+          <w:ilvl w:val="0"/>
+          <w:numId w:val="15"/>
+        </w:numPr>
+        <w:spacing w:line="360" w:lineRule="auto"/>
+        <w:jc w:val="both"/>
+        <w:rPr>
+          <w:rFonts w:ascii="Times New Roman" w:hAnsi="Times New Roman" w:cs="Times New Roman"/>
+          <w:sz w:val="26"/>
+          <w:szCs w:val="26"/>
+          <w:lang w:val="en-US"/>
+        </w:rPr>
+      </w:pPr>
+      <w:r>
+        <w:rPr>
+          <w:rFonts w:ascii="Times New Roman" w:hAnsi="Times New Roman" w:cs="Times New Roman"/>
+          <w:sz w:val="26"/>
+          <w:szCs w:val="26"/>
+        </w:rPr>
+        <w:t>Quản trị viên (Admin): là người quản lý và vận hành hệ thống.</w:t>
+      </w:r>
+    </w:p>
+    <w:p>
+      <w:pPr>
+        <w:spacing w:line="360" w:lineRule="auto"/>
+        <w:jc w:val="both"/>
+        <w:rPr>
+          <w:rFonts w:ascii="Times New Roman" w:hAnsi="Times New Roman" w:cs="Times New Roman"/>
+          <w:sz w:val="26"/>
+          <w:szCs w:val="26"/>
+          <w:lang w:val="en-US"/>
+        </w:rPr>
+      </w:pPr>
+      <w:r>
+        <w:rPr>
+          <w:rFonts w:ascii="Times New Roman" w:hAnsi="Times New Roman" w:cs="Times New Roman"/>
+          <w:sz w:val="26"/>
+          <w:szCs w:val="26"/>
+        </w:rPr>
+        <w:t>Mối quan hệ trong sơ đồ</w:t>
+      </w:r>
+      <w:r>
+        <w:rPr>
+          <w:rFonts w:ascii="Times New Roman" w:hAnsi="Times New Roman" w:cs="Times New Roman"/>
+          <w:sz w:val="26"/>
+          <w:szCs w:val="26"/>
+          <w:lang w:val="en-US"/>
+        </w:rPr>
+        <w:t>:</w:t>
+      </w:r>
+    </w:p>
+    <w:p>
+      <w:pPr>
+        <w:pStyle w:val="oancuaDanhsach"/>
+        <w:numPr>
+          <w:ilvl w:val="0"/>
+          <w:numId w:val="16"/>
+        </w:numPr>
+        <w:spacing w:line="360" w:lineRule="auto"/>
+        <w:jc w:val="both"/>
+        <w:rPr>
+          <w:rFonts w:ascii="Times New Roman" w:hAnsi="Times New Roman" w:cs="Times New Roman"/>
+          <w:sz w:val="26"/>
+          <w:szCs w:val="26"/>
+          <w:lang w:val="en-US"/>
+        </w:rPr>
+      </w:pPr>
+      <w:r>
+        <w:rPr>
+          <w:rFonts w:ascii="Times New Roman" w:hAnsi="Times New Roman" w:cs="Times New Roman"/>
+          <w:sz w:val="26"/>
+          <w:szCs w:val="26"/>
+        </w:rPr>
+        <w:t>Các chức năng được liên kết trực tiếp với từng tác nhân thể hiện quyền và phạm vi sử dụng của mỗi loại người dùng.</w:t>
+      </w:r>
+    </w:p>
+    <w:p>
+      <w:pPr>
+        <w:pStyle w:val="oancuaDanhsach"/>
+        <w:numPr>
+          <w:ilvl w:val="0"/>
+          <w:numId w:val="16"/>
+        </w:numPr>
+        <w:spacing w:line="360" w:lineRule="auto"/>
+        <w:jc w:val="both"/>
+        <w:rPr>
+          <w:rFonts w:ascii="Times New Roman" w:hAnsi="Times New Roman" w:cs="Times New Roman"/>
+          <w:sz w:val="26"/>
+          <w:szCs w:val="26"/>
+          <w:lang w:val="en-US"/>
+        </w:rPr>
+      </w:pPr>
+      <w:r>
+        <w:rPr>
+          <w:rFonts w:ascii="Times New Roman" w:hAnsi="Times New Roman" w:cs="Times New Roman"/>
+          <w:sz w:val="26"/>
+          <w:szCs w:val="26"/>
+        </w:rPr>
         <w:lastRenderedPageBreak/>
-        <w:t>Khả năng mở rộng: Có thể nâng cấp thêm các chức năng như thanh toán online hoặc ứng dụng mobile trong tương lai</w:t>
-      </w:r>
+        <w:t>Một số chức năng có thể bao gồm (include) hoặc mở rộng (extend) lẫn nhau, ví dụ:</w:t>
+      </w:r>
+    </w:p>
+    <w:p>
+      <w:pPr>
+        <w:pStyle w:val="oancuaDanhsach"/>
+        <w:numPr>
+          <w:ilvl w:val="0"/>
+          <w:numId w:val="10"/>
+        </w:numPr>
+        <w:spacing w:line="360" w:lineRule="auto"/>
+        <w:jc w:val="both"/>
+        <w:rPr>
+          <w:rFonts w:ascii="Times New Roman" w:hAnsi="Times New Roman" w:cs="Times New Roman"/>
+          <w:sz w:val="26"/>
+          <w:szCs w:val="26"/>
+          <w:lang w:val="en-US"/>
+        </w:rPr>
+      </w:pPr>
+      <w:r>
+        <w:rPr>
+          <w:rFonts w:ascii="Times New Roman" w:hAnsi="Times New Roman" w:cs="Times New Roman"/>
+          <w:sz w:val="26"/>
+          <w:szCs w:val="26"/>
+        </w:rPr>
+        <w:t>Chức năng Đặt hàng bao gồm (include) chức năng Quản lý giỏ hàng</w:t>
+      </w:r>
+    </w:p>
+    <w:p>
+      <w:pPr>
+        <w:pStyle w:val="oancuaDanhsach"/>
+        <w:numPr>
+          <w:ilvl w:val="0"/>
+          <w:numId w:val="10"/>
+        </w:numPr>
+        <w:spacing w:line="360" w:lineRule="auto"/>
+        <w:jc w:val="both"/>
+        <w:rPr>
+          <w:rFonts w:ascii="Times New Roman" w:hAnsi="Times New Roman" w:cs="Times New Roman"/>
+          <w:sz w:val="26"/>
+          <w:szCs w:val="26"/>
+          <w:lang w:val="en-US"/>
+        </w:rPr>
+      </w:pPr>
+      <w:r>
+        <w:rPr>
+          <w:rFonts w:ascii="Times New Roman" w:hAnsi="Times New Roman" w:cs="Times New Roman"/>
+          <w:sz w:val="26"/>
+          <w:szCs w:val="26"/>
+        </w:rPr>
+        <w:t>Chức năng Gợi ý sản phẩm mở rộng (extend) từ chức năng Xem sản phẩm</w:t>
+      </w:r>
+    </w:p>
+    <w:p>
+      <w:pPr>
+        <w:spacing w:line="360" w:lineRule="auto"/>
+        <w:jc w:val="both"/>
+        <w:rPr>
+          <w:rFonts w:ascii="Times New Roman" w:hAnsi="Times New Roman" w:cs="Times New Roman"/>
+          <w:sz w:val="26"/>
+          <w:szCs w:val="26"/>
+          <w:lang w:val="en-US"/>
+        </w:rPr>
+      </w:pPr>
+      <w:r>
+        <w:rPr>
+          <w:rFonts w:ascii="Times New Roman" w:hAnsi="Times New Roman" w:cs="Times New Roman"/>
+          <w:sz w:val="26"/>
+          <w:szCs w:val="26"/>
+        </w:rPr>
+        <w:t>Sơ đồ Use Case giúp xác định rõ các chức năng chính của hệ thống và vai trò của từng tác nhân, từ đó làm cơ sở cho việc phân tích, thiết kế và phát triển hệ thống trong các giai đoạn tiếp theo.</w:t>
+      </w:r>
+    </w:p>
+    <w:p>
+      <w:pPr>
+        <w:spacing w:line="360" w:lineRule="auto"/>
+        <w:jc w:val="both"/>
+        <w:rPr>
+          <w:rFonts w:ascii="Times New Roman" w:hAnsi="Times New Roman" w:cs="Times New Roman"/>
+          <w:sz w:val="26"/>
+          <w:szCs w:val="26"/>
+          <w:lang w:val="en-US"/>
+        </w:rPr>
+      </w:pPr>
+      <w:r>
+        <w:rPr>
+          <w:rFonts w:ascii="Times New Roman" w:hAnsi="Times New Roman" w:cs="Times New Roman"/>
+          <w:sz w:val="26"/>
+          <w:szCs w:val="26"/>
+          <w:lang w:val="en-US"/>
+        </w:rPr>
+        <w:t xml:space="preserve">Link github: </w:t>
+      </w:r>
+      <w:hyperlink r:id="rId7" w:history="1">
+        <w:r>
+          <w:rPr>
+            <w:rStyle w:val="Siuktni"/>
+            <w:rFonts w:ascii="Times New Roman" w:hAnsi="Times New Roman" w:cs="Times New Roman"/>
+            <w:sz w:val="26"/>
+            <w:szCs w:val="26"/>
+            <w:lang w:val="en-US"/>
+          </w:rPr>
+          <w:t>https://github.com/tranhoaii/363_DATN_TranThiHoai</w:t>
+        </w:r>
+      </w:hyperlink>
+    </w:p>
+    <w:p>
+      <w:pPr>
+        <w:spacing w:line="360" w:lineRule="auto"/>
+        <w:jc w:val="both"/>
+        <w:rPr>
+          <w:rFonts w:ascii="Times New Roman" w:hAnsi="Times New Roman" w:cs="Times New Roman"/>
+          <w:sz w:val="26"/>
+          <w:szCs w:val="26"/>
+          <w:lang w:val="en-US"/>
+        </w:rPr>
+      </w:pPr>
     </w:p>
     <w:sectPr>
       <w:pgSz w:w="12240" w:h="15840"/>
@@ -2321,14 +3358,14 @@
   <w:abstractNum w:abstractNumId="6" w15:restartNumberingAfterBreak="0">
     <w:nsid w:val="31844974"/>
     <w:multiLevelType w:val="hybridMultilevel"/>
-    <w:tmpl w:val="39DC21CA"/>
+    <w:tmpl w:val="D0C808B8"/>
     <w:lvl w:ilvl="0" w:tplc="042A0003">
       <w:start w:val="1"/>
       <w:numFmt w:val="bullet"/>
       <w:lvlText w:val="o"/>
       <w:lvlJc w:val="left"/>
       <w:pPr>
-        <w:ind w:left="1800" w:hanging="360"/>
+        <w:ind w:left="1080" w:hanging="360"/>
       </w:pPr>
       <w:rPr>
         <w:rFonts w:ascii="Courier New" w:hAnsi="Courier New" w:cs="Courier New" w:hint="default"/>
@@ -2634,6 +3671,119 @@
     </w:lvl>
   </w:abstractNum>
   <w:abstractNum w:abstractNumId="9" w15:restartNumberingAfterBreak="0">
+    <w:nsid w:val="3D20394D"/>
+    <w:multiLevelType w:val="hybridMultilevel"/>
+    <w:tmpl w:val="E29E8286"/>
+    <w:lvl w:ilvl="0" w:tplc="042A0001">
+      <w:start w:val="1"/>
+      <w:numFmt w:val="bullet"/>
+      <w:lvlText w:val=""/>
+      <w:lvlJc w:val="left"/>
+      <w:pPr>
+        <w:ind w:left="720" w:hanging="360"/>
+      </w:pPr>
+      <w:rPr>
+        <w:rFonts w:ascii="Symbol" w:hAnsi="Symbol" w:hint="default"/>
+      </w:rPr>
+    </w:lvl>
+    <w:lvl w:ilvl="1" w:tplc="042A0003" w:tentative="1">
+      <w:start w:val="1"/>
+      <w:numFmt w:val="bullet"/>
+      <w:lvlText w:val="o"/>
+      <w:lvlJc w:val="left"/>
+      <w:pPr>
+        <w:ind w:left="1440" w:hanging="360"/>
+      </w:pPr>
+      <w:rPr>
+        <w:rFonts w:ascii="Courier New" w:hAnsi="Courier New" w:cs="Courier New" w:hint="default"/>
+      </w:rPr>
+    </w:lvl>
+    <w:lvl w:ilvl="2" w:tplc="042A0005" w:tentative="1">
+      <w:start w:val="1"/>
+      <w:numFmt w:val="bullet"/>
+      <w:lvlText w:val=""/>
+      <w:lvlJc w:val="left"/>
+      <w:pPr>
+        <w:ind w:left="2160" w:hanging="360"/>
+      </w:pPr>
+      <w:rPr>
+        <w:rFonts w:ascii="Wingdings" w:hAnsi="Wingdings" w:hint="default"/>
+      </w:rPr>
+    </w:lvl>
+    <w:lvl w:ilvl="3" w:tplc="042A0001" w:tentative="1">
+      <w:start w:val="1"/>
+      <w:numFmt w:val="bullet"/>
+      <w:lvlText w:val=""/>
+      <w:lvlJc w:val="left"/>
+      <w:pPr>
+        <w:ind w:left="2880" w:hanging="360"/>
+      </w:pPr>
+      <w:rPr>
+        <w:rFonts w:ascii="Symbol" w:hAnsi="Symbol" w:hint="default"/>
+      </w:rPr>
+    </w:lvl>
+    <w:lvl w:ilvl="4" w:tplc="042A0003" w:tentative="1">
+      <w:start w:val="1"/>
+      <w:numFmt w:val="bullet"/>
+      <w:lvlText w:val="o"/>
+      <w:lvlJc w:val="left"/>
+      <w:pPr>
+        <w:ind w:left="3600" w:hanging="360"/>
+      </w:pPr>
+      <w:rPr>
+        <w:rFonts w:ascii="Courier New" w:hAnsi="Courier New" w:cs="Courier New" w:hint="default"/>
+      </w:rPr>
+    </w:lvl>
+    <w:lvl w:ilvl="5" w:tplc="042A0005" w:tentative="1">
+      <w:start w:val="1"/>
+      <w:numFmt w:val="bullet"/>
+      <w:lvlText w:val=""/>
+      <w:lvlJc w:val="left"/>
+      <w:pPr>
+        <w:ind w:left="4320" w:hanging="360"/>
+      </w:pPr>
+      <w:rPr>
+        <w:rFonts w:ascii="Wingdings" w:hAnsi="Wingdings" w:hint="default"/>
+      </w:rPr>
+    </w:lvl>
+    <w:lvl w:ilvl="6" w:tplc="042A0001" w:tentative="1">
+      <w:start w:val="1"/>
+      <w:numFmt w:val="bullet"/>
+      <w:lvlText w:val=""/>
+      <w:lvlJc w:val="left"/>
+      <w:pPr>
+        <w:ind w:left="5040" w:hanging="360"/>
+      </w:pPr>
+      <w:rPr>
+        <w:rFonts w:ascii="Symbol" w:hAnsi="Symbol" w:hint="default"/>
+      </w:rPr>
+    </w:lvl>
+    <w:lvl w:ilvl="7" w:tplc="042A0003" w:tentative="1">
+      <w:start w:val="1"/>
+      <w:numFmt w:val="bullet"/>
+      <w:lvlText w:val="o"/>
+      <w:lvlJc w:val="left"/>
+      <w:pPr>
+        <w:ind w:left="5760" w:hanging="360"/>
+      </w:pPr>
+      <w:rPr>
+        <w:rFonts w:ascii="Courier New" w:hAnsi="Courier New" w:cs="Courier New" w:hint="default"/>
+      </w:rPr>
+    </w:lvl>
+    <w:lvl w:ilvl="8" w:tplc="042A0005" w:tentative="1">
+      <w:start w:val="1"/>
+      <w:numFmt w:val="bullet"/>
+      <w:lvlText w:val=""/>
+      <w:lvlJc w:val="left"/>
+      <w:pPr>
+        <w:ind w:left="6480" w:hanging="360"/>
+      </w:pPr>
+      <w:rPr>
+        <w:rFonts w:ascii="Wingdings" w:hAnsi="Wingdings" w:hint="default"/>
+      </w:rPr>
+    </w:lvl>
+  </w:abstractNum>
+  <w:abstractNum w:abstractNumId="10" w15:restartNumberingAfterBreak="0">
     <w:nsid w:val="3FC36D72"/>
     <w:multiLevelType w:val="hybridMultilevel"/>
     <w:tmpl w:val="3CCCD8CE"/>
@@ -2722,7 +3872,7 @@
       </w:pPr>
     </w:lvl>
   </w:abstractNum>
-  <w:abstractNum w:abstractNumId="10" w15:restartNumberingAfterBreak="0">
+  <w:abstractNum w:abstractNumId="11" w15:restartNumberingAfterBreak="0">
     <w:nsid w:val="440838FE"/>
     <w:multiLevelType w:val="hybridMultilevel"/>
     <w:tmpl w:val="69B0E80E"/>
@@ -2835,7 +3985,7 @@
       </w:rPr>
     </w:lvl>
   </w:abstractNum>
-  <w:abstractNum w:abstractNumId="11" w15:restartNumberingAfterBreak="0">
+  <w:abstractNum w:abstractNumId="12" w15:restartNumberingAfterBreak="0">
     <w:nsid w:val="54951588"/>
     <w:multiLevelType w:val="hybridMultilevel"/>
     <w:tmpl w:val="4830AF18"/>
@@ -2948,7 +4098,7 @@
       </w:rPr>
     </w:lvl>
   </w:abstractNum>
-  <w:abstractNum w:abstractNumId="12" w15:restartNumberingAfterBreak="0">
+  <w:abstractNum w:abstractNumId="13" w15:restartNumberingAfterBreak="0">
     <w:nsid w:val="61321311"/>
     <w:multiLevelType w:val="hybridMultilevel"/>
     <w:tmpl w:val="0F08F722"/>
@@ -3061,7 +4211,7 @@
       </w:rPr>
     </w:lvl>
   </w:abstractNum>
-  <w:abstractNum w:abstractNumId="13" w15:restartNumberingAfterBreak="0">
+  <w:abstractNum w:abstractNumId="14" w15:restartNumberingAfterBreak="0">
     <w:nsid w:val="680564DA"/>
     <w:multiLevelType w:val="hybridMultilevel"/>
     <w:tmpl w:val="B002E1C8"/>
@@ -3168,6 +4318,119 @@
       <w:lvlJc w:val="left"/>
       <w:pPr>
         <w:ind w:left="7200" w:hanging="360"/>
+      </w:pPr>
+      <w:rPr>
+        <w:rFonts w:ascii="Wingdings" w:hAnsi="Wingdings" w:hint="default"/>
+      </w:rPr>
+    </w:lvl>
+  </w:abstractNum>
+  <w:abstractNum w:abstractNumId="15" w15:restartNumberingAfterBreak="0">
+    <w:nsid w:val="7F361033"/>
+    <w:multiLevelType w:val="hybridMultilevel"/>
+    <w:tmpl w:val="481813DA"/>
+    <w:lvl w:ilvl="0" w:tplc="042A0001">
+      <w:start w:val="1"/>
+      <w:numFmt w:val="bullet"/>
+      <w:lvlText w:val=""/>
+      <w:lvlJc w:val="left"/>
+      <w:pPr>
+        <w:ind w:left="720" w:hanging="360"/>
+      </w:pPr>
+      <w:rPr>
+        <w:rFonts w:ascii="Symbol" w:hAnsi="Symbol" w:hint="default"/>
+      </w:rPr>
+    </w:lvl>
+    <w:lvl w:ilvl="1" w:tplc="042A0003" w:tentative="1">
+      <w:start w:val="1"/>
+      <w:numFmt w:val="bullet"/>
+      <w:lvlText w:val="o"/>
+      <w:lvlJc w:val="left"/>
+      <w:pPr>
+        <w:ind w:left="1440" w:hanging="360"/>
+      </w:pPr>
+      <w:rPr>
+        <w:rFonts w:ascii="Courier New" w:hAnsi="Courier New" w:cs="Courier New" w:hint="default"/>
+      </w:rPr>
+    </w:lvl>
+    <w:lvl w:ilvl="2" w:tplc="042A0005" w:tentative="1">
+      <w:start w:val="1"/>
+      <w:numFmt w:val="bullet"/>
+      <w:lvlText w:val=""/>
+      <w:lvlJc w:val="left"/>
+      <w:pPr>
+        <w:ind w:left="2160" w:hanging="360"/>
+      </w:pPr>
+      <w:rPr>
+        <w:rFonts w:ascii="Wingdings" w:hAnsi="Wingdings" w:hint="default"/>
+      </w:rPr>
+    </w:lvl>
+    <w:lvl w:ilvl="3" w:tplc="042A0001" w:tentative="1">
+      <w:start w:val="1"/>
+      <w:numFmt w:val="bullet"/>
+      <w:lvlText w:val=""/>
+      <w:lvlJc w:val="left"/>
+      <w:pPr>
+        <w:ind w:left="2880" w:hanging="360"/>
+      </w:pPr>
+      <w:rPr>
+        <w:rFonts w:ascii="Symbol" w:hAnsi="Symbol" w:hint="default"/>
+      </w:rPr>
+    </w:lvl>
+    <w:lvl w:ilvl="4" w:tplc="042A0003" w:tentative="1">
+      <w:start w:val="1"/>
+      <w:numFmt w:val="bullet"/>
+      <w:lvlText w:val="o"/>
+      <w:lvlJc w:val="left"/>
+      <w:pPr>
+        <w:ind w:left="3600" w:hanging="360"/>
+      </w:pPr>
+      <w:rPr>
+        <w:rFonts w:ascii="Courier New" w:hAnsi="Courier New" w:cs="Courier New" w:hint="default"/>
+      </w:rPr>
+    </w:lvl>
+    <w:lvl w:ilvl="5" w:tplc="042A0005" w:tentative="1">
+      <w:start w:val="1"/>
+      <w:numFmt w:val="bullet"/>
+      <w:lvlText w:val=""/>
+      <w:lvlJc w:val="left"/>
+      <w:pPr>
+        <w:ind w:left="4320" w:hanging="360"/>
+      </w:pPr>
+      <w:rPr>
+        <w:rFonts w:ascii="Wingdings" w:hAnsi="Wingdings" w:hint="default"/>
+      </w:rPr>
+    </w:lvl>
+    <w:lvl w:ilvl="6" w:tplc="042A0001" w:tentative="1">
+      <w:start w:val="1"/>
+      <w:numFmt w:val="bullet"/>
+      <w:lvlText w:val=""/>
+      <w:lvlJc w:val="left"/>
+      <w:pPr>
+        <w:ind w:left="5040" w:hanging="360"/>
+      </w:pPr>
+      <w:rPr>
+        <w:rFonts w:ascii="Symbol" w:hAnsi="Symbol" w:hint="default"/>
+      </w:rPr>
+    </w:lvl>
+    <w:lvl w:ilvl="7" w:tplc="042A0003" w:tentative="1">
+      <w:start w:val="1"/>
+      <w:numFmt w:val="bullet"/>
+      <w:lvlText w:val="o"/>
+      <w:lvlJc w:val="left"/>
+      <w:pPr>
+        <w:ind w:left="5760" w:hanging="360"/>
+      </w:pPr>
+      <w:rPr>
+        <w:rFonts w:ascii="Courier New" w:hAnsi="Courier New" w:cs="Courier New" w:hint="default"/>
+      </w:rPr>
+    </w:lvl>
+    <w:lvl w:ilvl="8" w:tplc="042A0005" w:tentative="1">
+      <w:start w:val="1"/>
+      <w:numFmt w:val="bullet"/>
+      <w:lvlText w:val=""/>
+      <w:lvlJc w:val="left"/>
+      <w:pPr>
+        <w:ind w:left="6480" w:hanging="360"/>
       </w:pPr>
       <w:rPr>
         <w:rFonts w:ascii="Wingdings" w:hAnsi="Wingdings" w:hint="default"/>
@@ -3178,13 +4441,13 @@
     <w:abstractNumId w:val="5"/>
   </w:num>
   <w:num w:numId="2" w16cid:durableId="1063409638">
-    <w:abstractNumId w:val="13"/>
+    <w:abstractNumId w:val="14"/>
   </w:num>
   <w:num w:numId="3" w16cid:durableId="367409934">
     <w:abstractNumId w:val="8"/>
   </w:num>
   <w:num w:numId="4" w16cid:durableId="331497324">
-    <w:abstractNumId w:val="10"/>
+    <w:abstractNumId w:val="11"/>
   </w:num>
   <w:num w:numId="5" w16cid:durableId="306249994">
     <w:abstractNumId w:val="2"/>
@@ -3199,7 +4462,7 @@
     <w:abstractNumId w:val="4"/>
   </w:num>
   <w:num w:numId="9" w16cid:durableId="36589902">
-    <w:abstractNumId w:val="11"/>
+    <w:abstractNumId w:val="12"/>
   </w:num>
   <w:num w:numId="10" w16cid:durableId="1340235015">
     <w:abstractNumId w:val="6"/>
@@ -3208,13 +4471,19 @@
     <w:abstractNumId w:val="1"/>
   </w:num>
   <w:num w:numId="12" w16cid:durableId="1336493766">
-    <w:abstractNumId w:val="9"/>
+    <w:abstractNumId w:val="10"/>
   </w:num>
   <w:num w:numId="13" w16cid:durableId="337079695">
     <w:abstractNumId w:val="7"/>
   </w:num>
   <w:num w:numId="14" w16cid:durableId="882061348">
-    <w:abstractNumId w:val="12"/>
+    <w:abstractNumId w:val="13"/>
+  </w:num>
+  <w:num w:numId="15" w16cid:durableId="154759198">
+    <w:abstractNumId w:val="15"/>
+  </w:num>
+  <w:num w:numId="16" w16cid:durableId="746460699">
+    <w:abstractNumId w:val="9"/>
   </w:num>
 </w:numbering>
 </file>
@@ -4150,6 +5419,29 @@
       <w14:ligatures w14:val="none"/>
     </w:rPr>
   </w:style>
+  <w:style w:type="character" w:styleId="Siuktni">
+    <w:name w:val="Hyperlink"/>
+    <w:basedOn w:val="Phngmcinhcuaoanvn"/>
+    <w:uiPriority w:val="99"/>
+    <w:unhideWhenUsed/>
+    <w:rsid w:val="00CB498B"/>
+    <w:rPr>
+      <w:color w:val="0563C1" w:themeColor="hyperlink"/>
+      <w:u w:val="single"/>
+    </w:rPr>
+  </w:style>
+  <w:style w:type="character" w:styleId="cpChagiiquyt">
+    <w:name w:val="Unresolved Mention"/>
+    <w:basedOn w:val="Phngmcinhcuaoanvn"/>
+    <w:uiPriority w:val="99"/>
+    <w:semiHidden/>
+    <w:unhideWhenUsed/>
+    <w:rsid w:val="00CB498B"/>
+    <w:rPr>
+      <w:color w:val="605E5C"/>
+      <w:shd w:val="clear" w:color="auto" w:fill="E1DFDD"/>
+    </w:rPr>
+  </w:style>
 </w:styles>
 </file>
 

</xml_diff>